<commit_message>
Final Exercise 1 and 2 docs: concise plain-sentence answers
Co-Authored-By: Claude Opus 5.5 <noreply@anthropic.com>
Claude-Session: https://claude.ai/code/session_018f4s9PsFznaBLPycqNXRoH
</commit_message>
<xml_diff>
--- a/Exercise-1-Answers.docx
+++ b/Exercise-1-Answers.docx
@@ -358,7 +358,7 @@
         </w:numPr>
       </w:pPr>
       <w:r>
-        <w:t xml:space="preserve">With</w:t>
+        <w:t xml:space="preserve">The model has</w:t>
       </w:r>
       <w:r>
         <w:t xml:space="preserve"> </w:t>
@@ -372,54 +372,7 @@
         <w:t xml:space="preserve"> </w:t>
       </w:r>
       <w:r>
-        <w:t xml:space="preserve">observations (</w:t>
-      </w:r>
-      <m:oMath>
-        <m:r>
-          <m:t>i</m:t>
-        </m:r>
-        <m:r>
-          <m:rPr>
-            <m:sty m:val="p"/>
-          </m:rPr>
-          <m:t>=</m:t>
-        </m:r>
-        <m:r>
-          <m:t>1</m:t>
-        </m:r>
-        <m:r>
-          <m:rPr>
-            <m:sty m:val="p"/>
-          </m:rPr>
-          <m:t>,</m:t>
-        </m:r>
-        <m:r>
-          <m:t>2</m:t>
-        </m:r>
-        <m:r>
-          <m:rPr>
-            <m:sty m:val="p"/>
-          </m:rPr>
-          <m:t>,</m:t>
-        </m:r>
-        <m:r>
-          <m:rPr>
-            <m:sty m:val="p"/>
-          </m:rPr>
-          <m:t>…</m:t>
-        </m:r>
-        <m:r>
-          <m:rPr>
-            <m:sty m:val="p"/>
-          </m:rPr>
-          <m:t>,</m:t>
-        </m:r>
-        <m:r>
-          <m:t>n</m:t>
-        </m:r>
-      </m:oMath>
-      <w:r>
-        <w:t xml:space="preserve">) and 6 parameters, the model in expanded matrix form is</w:t>
+        <w:t xml:space="preserve">observations and 6 parameters. In expanded matrix form:</w:t>
       </w:r>
     </w:p>
     <w:p>
@@ -1796,7 +1749,10 @@
         </w:numPr>
       </w:pPr>
       <w:r>
-        <w:t xml:space="preserve">Following the notation of Lecture 1B (</w:t>
+        <w:t xml:space="preserve">In the form</w:t>
+      </w:r>
+      <w:r>
+        <w:t xml:space="preserve"> </w:t>
       </w:r>
       <m:oMath>
         <m:r>
@@ -1831,7 +1787,24 @@
         </m:r>
       </m:oMath>
       <w:r>
-        <w:t xml:space="preserve">), the data matrix is written in its transposed form, with a row of 1’s for the constant and one row for each variable:</w:t>
+        <w:t xml:space="preserve">, the data matrix is written as</w:t>
+      </w:r>
+      <w:r>
+        <w:t xml:space="preserve"> </w:t>
+      </w:r>
+      <m:oMath>
+        <m:r>
+          <m:t>X</m:t>
+        </m:r>
+        <m:r>
+          <m:rPr>
+            <m:sty m:val="p"/>
+          </m:rPr>
+          <m:t>′</m:t>
+        </m:r>
+      </m:oMath>
+      <w:r>
+        <w:t xml:space="preserve">:</w:t>
       </w:r>
     </w:p>
     <w:p>
@@ -2671,21 +2644,7 @@
         </m:r>
       </m:oMath>
       <w:r>
-        <w:t xml:space="preserve">) – vector of the</w:t>
-      </w:r>
-      <w:r>
-        <w:t xml:space="preserve"> </w:t>
-      </w:r>
-      <m:oMath>
-        <m:r>
-          <m:t>n</m:t>
-        </m:r>
-      </m:oMath>
-      <w:r>
-        <w:t xml:space="preserve"> </w:t>
-      </w:r>
-      <w:r>
-        <w:t xml:space="preserve">observations of Trade</w:t>
+        <w:t xml:space="preserve">) is the vector of Trade.</w:t>
       </w:r>
     </w:p>
     <w:p>
@@ -2722,7 +2681,44 @@
         </m:r>
       </m:oMath>
       <w:r>
-        <w:t xml:space="preserve">) – matrix of constants; column 1 is all 1’s (for</w:t>
+        <w:t xml:space="preserve">) is the matrix of the regressors. Its first column is all 1’s for the constant.</w:t>
+      </w:r>
+    </w:p>
+    <w:p>
+      <w:pPr>
+        <w:pStyle w:val="Compact"/>
+        <w:numPr>
+          <w:ilvl w:val="1"/>
+          <w:numId w:val="1002"/>
+        </w:numPr>
+      </w:pPr>
+      <m:oMath>
+        <m:r>
+          <m:t>β</m:t>
+        </m:r>
+      </m:oMath>
+      <w:r>
+        <w:t xml:space="preserve"> </w:t>
+      </w:r>
+      <w:r>
+        <w:t xml:space="preserve">(</w:t>
+      </w:r>
+      <m:oMath>
+        <m:r>
+          <m:t>6</m:t>
+        </m:r>
+        <m:r>
+          <m:rPr>
+            <m:sty m:val="p"/>
+          </m:rPr>
+          <m:t>×</m:t>
+        </m:r>
+        <m:r>
+          <m:t>1</m:t>
+        </m:r>
+      </m:oMath>
+      <w:r>
+        <w:t xml:space="preserve">) is the vector of the parameters</w:t>
       </w:r>
       <w:r>
         <w:t xml:space="preserve"> </w:t>
@@ -2742,97 +2738,15 @@
         </m:sSub>
       </m:oMath>
       <w:r>
-        <w:t xml:space="preserve">), and columns 2–6 hold Export, Import, ER, Tariff and Cost</w:t>
-      </w:r>
-    </w:p>
-    <w:p>
-      <w:pPr>
-        <w:pStyle w:val="Compact"/>
-        <w:numPr>
-          <w:ilvl w:val="1"/>
-          <w:numId w:val="1002"/>
-        </w:numPr>
-      </w:pPr>
+        <w:t xml:space="preserve"> </w:t>
+      </w:r>
+      <w:r>
+        <w:t xml:space="preserve">to</w:t>
+      </w:r>
+      <w:r>
+        <w:t xml:space="preserve"> </w:t>
+      </w:r>
       <m:oMath>
-        <m:r>
-          <m:t>β</m:t>
-        </m:r>
-      </m:oMath>
-      <w:r>
-        <w:t xml:space="preserve"> </w:t>
-      </w:r>
-      <w:r>
-        <w:t xml:space="preserve">(</w:t>
-      </w:r>
-      <m:oMath>
-        <m:r>
-          <m:t>6</m:t>
-        </m:r>
-        <m:r>
-          <m:rPr>
-            <m:sty m:val="p"/>
-          </m:rPr>
-          <m:t>×</m:t>
-        </m:r>
-        <m:r>
-          <m:t>1</m:t>
-        </m:r>
-      </m:oMath>
-      <w:r>
-        <w:t xml:space="preserve">) – vector of regression parameters</w:t>
-      </w:r>
-      <w:r>
-        <w:t xml:space="preserve"> </w:t>
-      </w:r>
-      <m:oMath>
-        <m:sSub>
-          <m:e>
-            <m:r>
-              <m:t>β</m:t>
-            </m:r>
-          </m:e>
-          <m:sub>
-            <m:r>
-              <m:t>0</m:t>
-            </m:r>
-          </m:sub>
-        </m:sSub>
-        <m:r>
-          <m:rPr>
-            <m:sty m:val="p"/>
-          </m:rPr>
-          <m:t>,</m:t>
-        </m:r>
-        <m:sSub>
-          <m:e>
-            <m:r>
-              <m:t>β</m:t>
-            </m:r>
-          </m:e>
-          <m:sub>
-            <m:r>
-              <m:t>1</m:t>
-            </m:r>
-          </m:sub>
-        </m:sSub>
-        <m:r>
-          <m:rPr>
-            <m:sty m:val="p"/>
-          </m:rPr>
-          <m:t>,</m:t>
-        </m:r>
-        <m:r>
-          <m:rPr>
-            <m:sty m:val="p"/>
-          </m:rPr>
-          <m:t>…</m:t>
-        </m:r>
-        <m:r>
-          <m:rPr>
-            <m:sty m:val="p"/>
-          </m:rPr>
-          <m:t>,</m:t>
-        </m:r>
         <m:sSub>
           <m:e>
             <m:r>
@@ -2846,6 +2760,9 @@
           </m:sub>
         </m:sSub>
       </m:oMath>
+      <w:r>
+        <w:t xml:space="preserve">.</w:t>
+      </w:r>
     </w:p>
     <w:p>
       <w:pPr>
@@ -2881,47 +2798,8 @@
         </m:r>
       </m:oMath>
       <w:r>
-        <w:t xml:space="preserve">) – vector of random error terms, independent</w:t>
-      </w:r>
-      <w:r>
-        <w:t xml:space="preserve"> </w:t>
-      </w:r>
-      <m:oMath>
-        <m:r>
-          <m:t>N</m:t>
-        </m:r>
-        <m:d>
-          <m:dPr>
-            <m:begChr m:val="("/>
-            <m:sepChr m:val=""/>
-            <m:endChr m:val=")"/>
-            <m:grow/>
-          </m:dPr>
-          <m:e>
-            <m:r>
-              <m:t>0</m:t>
-            </m:r>
-            <m:r>
-              <m:rPr>
-                <m:sty m:val="p"/>
-              </m:rPr>
-              <m:t>,</m:t>
-            </m:r>
-            <m:sSup>
-              <m:e>
-                <m:r>
-                  <m:t>σ</m:t>
-                </m:r>
-              </m:e>
-              <m:sup>
-                <m:r>
-                  <m:t>2</m:t>
-                </m:r>
-              </m:sup>
-            </m:sSup>
-          </m:e>
-        </m:d>
-      </m:oMath>
+        <w:t xml:space="preserve">) is the vector of random error terms.</w:t>
+      </w:r>
     </w:p>
     <w:p>
       <w:pPr>
@@ -2958,7 +2836,7 @@
         </w:numPr>
       </w:pPr>
       <w:r>
-        <w:t xml:space="preserve">The least squares solution minimizes</w:t>
+        <w:t xml:space="preserve">Least squares minimizes</w:t>
       </w:r>
       <w:r>
         <w:t xml:space="preserve"> </w:t>
@@ -2982,70 +2860,29 @@
           </m:rPr>
           <m:t>=</m:t>
         </m:r>
-        <m:d>
-          <m:dPr>
-            <m:begChr m:val="("/>
-            <m:sepChr m:val=""/>
-            <m:endChr m:val=")"/>
-            <m:grow/>
-          </m:dPr>
-          <m:e>
-            <m:r>
-              <m:t>Y</m:t>
-            </m:r>
-            <m:r>
-              <m:rPr>
-                <m:sty m:val="p"/>
-              </m:rPr>
-              <m:t>−</m:t>
-            </m:r>
-            <m:r>
-              <m:t>X</m:t>
-            </m:r>
-            <m:r>
-              <m:t>β</m:t>
-            </m:r>
-          </m:e>
-        </m:d>
+        <m:r>
+          <m:t>Y</m:t>
+        </m:r>
         <m:r>
           <m:rPr>
             <m:sty m:val="p"/>
           </m:rPr>
           <m:t>′</m:t>
         </m:r>
-        <m:d>
-          <m:dPr>
-            <m:begChr m:val="("/>
-            <m:sepChr m:val=""/>
-            <m:endChr m:val=")"/>
-            <m:grow/>
-          </m:dPr>
-          <m:e>
-            <m:r>
-              <m:t>Y</m:t>
-            </m:r>
-            <m:r>
-              <m:rPr>
-                <m:sty m:val="p"/>
-              </m:rPr>
-              <m:t>−</m:t>
-            </m:r>
-            <m:r>
-              <m:t>X</m:t>
-            </m:r>
-            <m:r>
-              <m:t>β</m:t>
-            </m:r>
-          </m:e>
-        </m:d>
+        <m:r>
+          <m:t>Y</m:t>
+        </m:r>
         <m:r>
           <m:rPr>
             <m:sty m:val="p"/>
           </m:rPr>
-          <m:t>=</m:t>
-        </m:r>
-        <m:r>
-          <m:t>Y</m:t>
+          <m:t>−</m:t>
+        </m:r>
+        <m:r>
+          <m:t>2</m:t>
+        </m:r>
+        <m:r>
+          <m:t>β</m:t>
         </m:r>
         <m:r>
           <m:rPr>
@@ -3054,19 +2891,7 @@
           <m:t>′</m:t>
         </m:r>
         <m:r>
-          <m:t>Y</m:t>
-        </m:r>
-        <m:r>
-          <m:rPr>
-            <m:sty m:val="p"/>
-          </m:rPr>
-          <m:t>−</m:t>
-        </m:r>
-        <m:r>
-          <m:t>2</m:t>
-        </m:r>
-        <m:r>
-          <m:t>β</m:t>
+          <m:t>X</m:t>
         </m:r>
         <m:r>
           <m:rPr>
@@ -3075,7 +2900,16 @@
           <m:t>′</m:t>
         </m:r>
         <m:r>
-          <m:t>X</m:t>
+          <m:t>Y</m:t>
+        </m:r>
+        <m:r>
+          <m:rPr>
+            <m:sty m:val="p"/>
+          </m:rPr>
+          <m:t>+</m:t>
+        </m:r>
+        <m:r>
+          <m:t>β</m:t>
         </m:r>
         <m:r>
           <m:rPr>
@@ -3084,16 +2918,7 @@
           <m:t>′</m:t>
         </m:r>
         <m:r>
-          <m:t>Y</m:t>
-        </m:r>
-        <m:r>
-          <m:rPr>
-            <m:sty m:val="p"/>
-          </m:rPr>
-          <m:t>+</m:t>
-        </m:r>
-        <m:r>
-          <m:t>β</m:t>
+          <m:t>X</m:t>
         </m:r>
         <m:r>
           <m:rPr>
@@ -3105,20 +2930,11 @@
           <m:t>X</m:t>
         </m:r>
         <m:r>
-          <m:rPr>
-            <m:sty m:val="p"/>
-          </m:rPr>
-          <m:t>′</m:t>
-        </m:r>
-        <m:r>
-          <m:t>X</m:t>
-        </m:r>
-        <m:r>
           <m:t>β</m:t>
         </m:r>
       </m:oMath>
       <w:r>
-        <w:t xml:space="preserve">. Setting the first-order condition to zero:</w:t>
+        <w:t xml:space="preserve">. Set the first-order condition to zero:</w:t>
       </w:r>
     </w:p>
     <w:p>
@@ -3376,21 +3192,7 @@
         </w:numPr>
       </w:pPr>
       <w:r>
-        <w:t xml:space="preserve">All sums run over the</w:t>
-      </w:r>
-      <w:r>
-        <w:t xml:space="preserve"> </w:t>
-      </w:r>
-      <m:oMath>
-        <m:r>
-          <m:t>n</m:t>
-        </m:r>
-      </m:oMath>
-      <w:r>
-        <w:t xml:space="preserve"> </w:t>
-      </w:r>
-      <w:r>
-        <w:t xml:space="preserve">observations,</w:t>
+        <w:t xml:space="preserve">All sums run from</w:t>
       </w:r>
       <w:r>
         <w:t xml:space="preserve"> </w:t>
@@ -3422,114 +3224,6 @@
         <m:r>
           <m:t>n</m:t>
         </m:r>
-      </m:oMath>
-      <w:r>
-        <w:t xml:space="preserve">; for example,</w:t>
-      </w:r>
-      <w:r>
-        <w:t xml:space="preserve"> </w:t>
-      </w:r>
-      <m:oMath>
-        <m:r>
-          <m:rPr>
-            <m:sty m:val="p"/>
-          </m:rPr>
-          <m:t>∑</m:t>
-        </m:r>
-        <m:r>
-          <m:rPr>
-            <m:nor/>
-          </m:rPr>
-          <m:t>Export</m:t>
-        </m:r>
-        <m:r>
-          <m:rPr>
-            <m:sty m:val="p"/>
-          </m:rPr>
-          <m:t>⋅</m:t>
-        </m:r>
-        <m:r>
-          <m:rPr>
-            <m:nor/>
-          </m:rPr>
-          <m:t>Import</m:t>
-        </m:r>
-      </m:oMath>
-      <w:r>
-        <w:t xml:space="preserve"> </w:t>
-      </w:r>
-      <w:r>
-        <w:t xml:space="preserve">means</w:t>
-      </w:r>
-      <w:r>
-        <w:t xml:space="preserve"> </w:t>
-      </w:r>
-      <m:oMath>
-        <m:nary>
-          <m:naryPr>
-            <m:chr m:val="∑"/>
-            <m:limLoc m:val="undOvr"/>
-            <m:subHide m:val="off"/>
-            <m:supHide m:val="off"/>
-          </m:naryPr>
-          <m:sub>
-            <m:r>
-              <m:t>i</m:t>
-            </m:r>
-            <m:r>
-              <m:rPr>
-                <m:sty m:val="p"/>
-              </m:rPr>
-              <m:t>=</m:t>
-            </m:r>
-            <m:r>
-              <m:t>1</m:t>
-            </m:r>
-          </m:sub>
-          <m:sup>
-            <m:r>
-              <m:t>n</m:t>
-            </m:r>
-          </m:sup>
-          <m:e>
-            <m:sSub>
-              <m:e>
-                <m:r>
-                  <m:rPr>
-                    <m:nor/>
-                  </m:rPr>
-                  <m:t>Export</m:t>
-                </m:r>
-              </m:e>
-              <m:sub>
-                <m:r>
-                  <m:t>i</m:t>
-                </m:r>
-              </m:sub>
-            </m:sSub>
-          </m:e>
-        </m:nary>
-        <m:r>
-          <m:rPr>
-            <m:sty m:val="p"/>
-          </m:rPr>
-          <m:t>⋅</m:t>
-        </m:r>
-        <m:sSub>
-          <m:e>
-            <m:r>
-              <m:rPr>
-                <m:nor/>
-              </m:rPr>
-              <m:t>Import</m:t>
-            </m:r>
-          </m:e>
-          <m:sub>
-            <m:r>
-              <m:t>i</m:t>
-            </m:r>
-          </m:sub>
-        </m:sSub>
       </m:oMath>
       <w:r>
         <w:t xml:space="preserve">.</w:t>
@@ -5000,21 +4694,7 @@
         </w:numPr>
       </w:pPr>
       <w:r>
-        <w:t xml:space="preserve">Each element is (row</w:t>
-      </w:r>
-      <w:r>
-        <w:t xml:space="preserve"> </w:t>
-      </w:r>
-      <m:oMath>
-        <m:r>
-          <m:t>j</m:t>
-        </m:r>
-      </m:oMath>
-      <w:r>
-        <w:t xml:space="preserve"> </w:t>
-      </w:r>
-      <w:r>
-        <w:t xml:space="preserve">of</w:t>
+        <w:t xml:space="preserve">Each element is a row of</w:t>
       </w:r>
       <w:r>
         <w:t xml:space="preserve"> </w:t>
@@ -5031,32 +4711,21 @@
         </m:r>
       </m:oMath>
       <w:r>
-        <w:t xml:space="preserve">) times (column</w:t>
-      </w:r>
-      <w:r>
         <w:t xml:space="preserve"> </w:t>
       </w:r>
+      <w:r>
+        <w:t xml:space="preserve">times a column of</w:t>
+      </w:r>
+      <w:r>
+        <w:t xml:space="preserve"> </w:t>
+      </w:r>
       <m:oMath>
         <m:r>
-          <m:t>k</m:t>
+          <m:t>X</m:t>
         </m:r>
       </m:oMath>
       <w:r>
-        <w:t xml:space="preserve"> </w:t>
-      </w:r>
-      <w:r>
-        <w:t xml:space="preserve">of</w:t>
-      </w:r>
-      <w:r>
-        <w:t xml:space="preserve"> </w:t>
-      </w:r>
-      <m:oMath>
-        <m:r>
-          <m:t>X</m:t>
-        </m:r>
-      </m:oMath>
-      <w:r>
-        <w:t xml:space="preserve">), that is, the sum over all observations of the product of the two variables:</w:t>
+        <w:t xml:space="preserve">:</w:t>
       </w:r>
     </w:p>
     <w:p>
@@ -6136,99 +5805,19 @@
         </w:numPr>
       </w:pPr>
       <w:r>
-        <w:t xml:space="preserve">Row 1</w:t>
+        <w:t xml:space="preserve">Row 1 times column 1 gives</w:t>
       </w:r>
       <w:r>
         <w:t xml:space="preserve"> </w:t>
       </w:r>
       <m:oMath>
         <m:r>
-          <m:rPr>
-            <m:sty m:val="p"/>
-          </m:rPr>
-          <m:t>×</m:t>
+          <m:t>n</m:t>
         </m:r>
       </m:oMath>
       <w:r>
-        <w:t xml:space="preserve"> </w:t>
-      </w:r>
-      <w:r>
-        <w:t xml:space="preserve">column 1:</w:t>
-      </w:r>
-      <w:r>
-        <w:t xml:space="preserve"> </w:t>
-      </w:r>
-      <m:oMath>
-        <m:r>
-          <m:t>1</m:t>
-        </m:r>
-        <m:r>
-          <m:rPr>
-            <m:sty m:val="p"/>
-          </m:rPr>
-          <m:t>⋅</m:t>
-        </m:r>
-        <m:r>
-          <m:t>1</m:t>
-        </m:r>
-        <m:r>
-          <m:rPr>
-            <m:sty m:val="p"/>
-          </m:rPr>
-          <m:t>+</m:t>
-        </m:r>
-        <m:r>
-          <m:t>1</m:t>
-        </m:r>
-        <m:r>
-          <m:rPr>
-            <m:sty m:val="p"/>
-          </m:rPr>
-          <m:t>⋅</m:t>
-        </m:r>
-        <m:r>
-          <m:t>1</m:t>
-        </m:r>
-        <m:r>
-          <m:rPr>
-            <m:sty m:val="p"/>
-          </m:rPr>
-          <m:t>+</m:t>
-        </m:r>
-        <m:r>
-          <m:rPr>
-            <m:sty m:val="p"/>
-          </m:rPr>
-          <m:t>⋯</m:t>
-        </m:r>
-        <m:r>
-          <m:rPr>
-            <m:sty m:val="p"/>
-          </m:rPr>
-          <m:t>+</m:t>
-        </m:r>
-        <m:r>
-          <m:t>1</m:t>
-        </m:r>
-        <m:r>
-          <m:rPr>
-            <m:sty m:val="p"/>
-          </m:rPr>
-          <m:t>⋅</m:t>
-        </m:r>
-        <m:r>
-          <m:t>1</m:t>
-        </m:r>
-        <m:r>
-          <m:rPr>
-            <m:sty m:val="p"/>
-          </m:rPr>
-          <m:t>=</m:t>
-        </m:r>
-        <m:r>
-          <m:t>n</m:t>
-        </m:r>
-      </m:oMath>
+        <w:t xml:space="preserve">.</w:t>
+      </w:r>
     </w:p>
     <w:p>
       <w:pPr>
@@ -6239,216 +5828,7 @@
         </w:numPr>
       </w:pPr>
       <w:r>
-        <w:t xml:space="preserve">Row 1</w:t>
-      </w:r>
-      <w:r>
-        <w:t xml:space="preserve"> </w:t>
-      </w:r>
-      <m:oMath>
-        <m:r>
-          <m:rPr>
-            <m:sty m:val="p"/>
-          </m:rPr>
-          <m:t>×</m:t>
-        </m:r>
-      </m:oMath>
-      <w:r>
-        <w:t xml:space="preserve"> </w:t>
-      </w:r>
-      <w:r>
-        <w:t xml:space="preserve">the other columns (and the other rows</w:t>
-      </w:r>
-      <w:r>
-        <w:t xml:space="preserve"> </w:t>
-      </w:r>
-      <m:oMath>
-        <m:r>
-          <m:rPr>
-            <m:sty m:val="p"/>
-          </m:rPr>
-          <m:t>×</m:t>
-        </m:r>
-      </m:oMath>
-      <w:r>
-        <w:t xml:space="preserve"> </w:t>
-      </w:r>
-      <w:r>
-        <w:t xml:space="preserve">column 1):</w:t>
-      </w:r>
-      <w:r>
-        <w:t xml:space="preserve"> </w:t>
-      </w:r>
-      <m:oMath>
-        <m:r>
-          <m:t>1</m:t>
-        </m:r>
-        <m:r>
-          <m:rPr>
-            <m:sty m:val="p"/>
-          </m:rPr>
-          <m:t>⋅</m:t>
-        </m:r>
-        <m:sSub>
-          <m:e>
-            <m:r>
-              <m:rPr>
-                <m:nor/>
-              </m:rPr>
-              <m:t>Export</m:t>
-            </m:r>
-          </m:e>
-          <m:sub>
-            <m:r>
-              <m:t>1</m:t>
-            </m:r>
-          </m:sub>
-        </m:sSub>
-        <m:r>
-          <m:rPr>
-            <m:sty m:val="p"/>
-          </m:rPr>
-          <m:t>+</m:t>
-        </m:r>
-        <m:r>
-          <m:rPr>
-            <m:sty m:val="p"/>
-          </m:rPr>
-          <m:t>⋯</m:t>
-        </m:r>
-        <m:r>
-          <m:rPr>
-            <m:sty m:val="p"/>
-          </m:rPr>
-          <m:t>+</m:t>
-        </m:r>
-        <m:r>
-          <m:t>1</m:t>
-        </m:r>
-        <m:r>
-          <m:rPr>
-            <m:sty m:val="p"/>
-          </m:rPr>
-          <m:t>⋅</m:t>
-        </m:r>
-        <m:sSub>
-          <m:e>
-            <m:r>
-              <m:rPr>
-                <m:nor/>
-              </m:rPr>
-              <m:t>Export</m:t>
-            </m:r>
-          </m:e>
-          <m:sub>
-            <m:r>
-              <m:t>n</m:t>
-            </m:r>
-          </m:sub>
-        </m:sSub>
-        <m:r>
-          <m:rPr>
-            <m:sty m:val="p"/>
-          </m:rPr>
-          <m:t>=</m:t>
-        </m:r>
-        <m:r>
-          <m:rPr>
-            <m:sty m:val="p"/>
-          </m:rPr>
-          <m:t>∑</m:t>
-        </m:r>
-        <m:r>
-          <m:rPr>
-            <m:nor/>
-          </m:rPr>
-          <m:t>Export</m:t>
-        </m:r>
-      </m:oMath>
-      <w:r>
-        <w:t xml:space="preserve">, and likewise</w:t>
-      </w:r>
-      <w:r>
-        <w:t xml:space="preserve"> </w:t>
-      </w:r>
-      <m:oMath>
-        <m:r>
-          <m:rPr>
-            <m:sty m:val="p"/>
-          </m:rPr>
-          <m:t>∑</m:t>
-        </m:r>
-        <m:r>
-          <m:rPr>
-            <m:nor/>
-          </m:rPr>
-          <m:t>Import</m:t>
-        </m:r>
-      </m:oMath>
-      <w:r>
-        <w:t xml:space="preserve">,</w:t>
-      </w:r>
-      <w:r>
-        <w:t xml:space="preserve"> </w:t>
-      </w:r>
-      <m:oMath>
-        <m:r>
-          <m:rPr>
-            <m:sty m:val="p"/>
-          </m:rPr>
-          <m:t>∑</m:t>
-        </m:r>
-        <m:r>
-          <m:rPr>
-            <m:nor/>
-          </m:rPr>
-          <m:t>ER</m:t>
-        </m:r>
-      </m:oMath>
-      <w:r>
-        <w:t xml:space="preserve">,</w:t>
-      </w:r>
-      <w:r>
-        <w:t xml:space="preserve"> </w:t>
-      </w:r>
-      <m:oMath>
-        <m:r>
-          <m:rPr>
-            <m:sty m:val="p"/>
-          </m:rPr>
-          <m:t>∑</m:t>
-        </m:r>
-        <m:r>
-          <m:rPr>
-            <m:nor/>
-          </m:rPr>
-          <m:t>Tariff</m:t>
-        </m:r>
-      </m:oMath>
-      <w:r>
-        <w:t xml:space="preserve">,</w:t>
-      </w:r>
-      <w:r>
-        <w:t xml:space="preserve"> </w:t>
-      </w:r>
-      <m:oMath>
-        <m:r>
-          <m:rPr>
-            <m:sty m:val="p"/>
-          </m:rPr>
-          <m:t>∑</m:t>
-        </m:r>
-        <m:r>
-          <m:rPr>
-            <m:nor/>
-          </m:rPr>
-          <m:t>Cost</m:t>
-        </m:r>
-      </m:oMath>
-      <w:r>
-        <w:t xml:space="preserve"> </w:t>
-      </w:r>
-      <w:r>
-        <w:t xml:space="preserve">(the sum of each variable)</w:t>
+        <w:t xml:space="preserve">Row 1 times the other columns gives the sum of each variable.</w:t>
       </w:r>
     </w:p>
     <w:p>
@@ -6460,155 +5840,7 @@
         </w:numPr>
       </w:pPr>
       <w:r>
-        <w:t xml:space="preserve">Diagonal:</w:t>
-      </w:r>
-      <w:r>
-        <w:t xml:space="preserve"> </w:t>
-      </w:r>
-      <m:oMath>
-        <m:r>
-          <m:rPr>
-            <m:sty m:val="p"/>
-          </m:rPr>
-          <m:t>∑</m:t>
-        </m:r>
-        <m:sSup>
-          <m:e>
-            <m:r>
-              <m:rPr>
-                <m:nor/>
-              </m:rPr>
-              <m:t>Export</m:t>
-            </m:r>
-          </m:e>
-          <m:sup>
-            <m:r>
-              <m:t>2</m:t>
-            </m:r>
-          </m:sup>
-        </m:sSup>
-      </m:oMath>
-      <w:r>
-        <w:t xml:space="preserve">,</w:t>
-      </w:r>
-      <w:r>
-        <w:t xml:space="preserve"> </w:t>
-      </w:r>
-      <m:oMath>
-        <m:r>
-          <m:rPr>
-            <m:sty m:val="p"/>
-          </m:rPr>
-          <m:t>∑</m:t>
-        </m:r>
-        <m:sSup>
-          <m:e>
-            <m:r>
-              <m:rPr>
-                <m:nor/>
-              </m:rPr>
-              <m:t>Import</m:t>
-            </m:r>
-          </m:e>
-          <m:sup>
-            <m:r>
-              <m:t>2</m:t>
-            </m:r>
-          </m:sup>
-        </m:sSup>
-      </m:oMath>
-      <w:r>
-        <w:t xml:space="preserve">,</w:t>
-      </w:r>
-      <w:r>
-        <w:t xml:space="preserve"> </w:t>
-      </w:r>
-      <m:oMath>
-        <m:r>
-          <m:rPr>
-            <m:sty m:val="p"/>
-          </m:rPr>
-          <m:t>∑</m:t>
-        </m:r>
-        <m:sSup>
-          <m:e>
-            <m:r>
-              <m:rPr>
-                <m:nor/>
-              </m:rPr>
-              <m:t>ER</m:t>
-            </m:r>
-          </m:e>
-          <m:sup>
-            <m:r>
-              <m:t>2</m:t>
-            </m:r>
-          </m:sup>
-        </m:sSup>
-      </m:oMath>
-      <w:r>
-        <w:t xml:space="preserve">,</w:t>
-      </w:r>
-      <w:r>
-        <w:t xml:space="preserve"> </w:t>
-      </w:r>
-      <m:oMath>
-        <m:r>
-          <m:rPr>
-            <m:sty m:val="p"/>
-          </m:rPr>
-          <m:t>∑</m:t>
-        </m:r>
-        <m:sSup>
-          <m:e>
-            <m:r>
-              <m:rPr>
-                <m:nor/>
-              </m:rPr>
-              <m:t>Tariff</m:t>
-            </m:r>
-          </m:e>
-          <m:sup>
-            <m:r>
-              <m:t>2</m:t>
-            </m:r>
-          </m:sup>
-        </m:sSup>
-      </m:oMath>
-      <w:r>
-        <w:t xml:space="preserve">,</w:t>
-      </w:r>
-      <w:r>
-        <w:t xml:space="preserve"> </w:t>
-      </w:r>
-      <m:oMath>
-        <m:r>
-          <m:rPr>
-            <m:sty m:val="p"/>
-          </m:rPr>
-          <m:t>∑</m:t>
-        </m:r>
-        <m:sSup>
-          <m:e>
-            <m:r>
-              <m:rPr>
-                <m:nor/>
-              </m:rPr>
-              <m:t>Cost</m:t>
-            </m:r>
-          </m:e>
-          <m:sup>
-            <m:r>
-              <m:t>2</m:t>
-            </m:r>
-          </m:sup>
-        </m:sSup>
-      </m:oMath>
-      <w:r>
-        <w:t xml:space="preserve"> </w:t>
-      </w:r>
-      <w:r>
-        <w:t xml:space="preserve">(the sum of squares of each variable)</w:t>
+        <w:t xml:space="preserve">The diagonal gives the sum of squares of each variable.</w:t>
       </w:r>
     </w:p>
     <w:p>
@@ -6620,98 +5852,8 @@
         </w:numPr>
       </w:pPr>
       <w:r>
-        <w:t xml:space="preserve">Off-diagonal: sums of cross-products, e.g. </w:t>
-      </w:r>
-      <m:oMath>
-        <m:r>
-          <m:rPr>
-            <m:sty m:val="p"/>
-          </m:rPr>
-          <m:t>∑</m:t>
-        </m:r>
-        <m:r>
-          <m:rPr>
-            <m:nor/>
-          </m:rPr>
-          <m:t>Export</m:t>
-        </m:r>
-        <m:r>
-          <m:rPr>
-            <m:sty m:val="p"/>
-          </m:rPr>
-          <m:t>⋅</m:t>
-        </m:r>
-        <m:r>
-          <m:rPr>
-            <m:nor/>
-          </m:rPr>
-          <m:t>Import</m:t>
-        </m:r>
-      </m:oMath>
-      <w:r>
-        <w:t xml:space="preserve">,</w:t>
-      </w:r>
-      <w:r>
-        <w:t xml:space="preserve"> </w:t>
-      </w:r>
-      <m:oMath>
-        <m:r>
-          <m:rPr>
-            <m:sty m:val="p"/>
-          </m:rPr>
-          <m:t>∑</m:t>
-        </m:r>
-        <m:r>
-          <m:rPr>
-            <m:nor/>
-          </m:rPr>
-          <m:t>ER</m:t>
-        </m:r>
-        <m:r>
-          <m:rPr>
-            <m:sty m:val="p"/>
-          </m:rPr>
-          <m:t>⋅</m:t>
-        </m:r>
-        <m:r>
-          <m:rPr>
-            <m:nor/>
-          </m:rPr>
-          <m:t>Tariff</m:t>
-        </m:r>
-      </m:oMath>
-      <w:r>
-        <w:t xml:space="preserve">,</w:t>
-      </w:r>
-      <w:r>
-        <w:t xml:space="preserve"> </w:t>
-      </w:r>
-      <m:oMath>
-        <m:r>
-          <m:rPr>
-            <m:sty m:val="p"/>
-          </m:rPr>
-          <m:t>∑</m:t>
-        </m:r>
-        <m:r>
-          <m:rPr>
-            <m:nor/>
-          </m:rPr>
-          <m:t>Tariff</m:t>
-        </m:r>
-        <m:r>
-          <m:rPr>
-            <m:sty m:val="p"/>
-          </m:rPr>
-          <m:t>⋅</m:t>
-        </m:r>
-        <m:r>
-          <m:rPr>
-            <m:nor/>
-          </m:rPr>
-          <m:t>Cost</m:t>
-        </m:r>
-      </m:oMath>
+        <w:t xml:space="preserve">The other elements give the sums of cross-products of two variables.</w:t>
+      </w:r>
     </w:p>
     <w:p>
       <w:pPr>
@@ -6739,69 +5881,7 @@
         <w:t xml:space="preserve"> </w:t>
       </w:r>
       <w:r>
-        <w:t xml:space="preserve">is symmetric, since</w:t>
-      </w:r>
-      <w:r>
-        <w:t xml:space="preserve"> </w:t>
-      </w:r>
-      <m:oMath>
-        <m:r>
-          <m:rPr>
-            <m:sty m:val="p"/>
-          </m:rPr>
-          <m:t>∑</m:t>
-        </m:r>
-        <m:r>
-          <m:rPr>
-            <m:nor/>
-          </m:rPr>
-          <m:t>Export</m:t>
-        </m:r>
-        <m:r>
-          <m:rPr>
-            <m:sty m:val="p"/>
-          </m:rPr>
-          <m:t>⋅</m:t>
-        </m:r>
-        <m:r>
-          <m:rPr>
-            <m:nor/>
-          </m:rPr>
-          <m:t>Import</m:t>
-        </m:r>
-        <m:r>
-          <m:rPr>
-            <m:sty m:val="p"/>
-          </m:rPr>
-          <m:t>=</m:t>
-        </m:r>
-        <m:r>
-          <m:rPr>
-            <m:sty m:val="p"/>
-          </m:rPr>
-          <m:t>∑</m:t>
-        </m:r>
-        <m:r>
-          <m:rPr>
-            <m:nor/>
-          </m:rPr>
-          <m:t>Import</m:t>
-        </m:r>
-        <m:r>
-          <m:rPr>
-            <m:sty m:val="p"/>
-          </m:rPr>
-          <m:t>⋅</m:t>
-        </m:r>
-        <m:r>
-          <m:rPr>
-            <m:nor/>
-          </m:rPr>
-          <m:t>Export</m:t>
-        </m:r>
-      </m:oMath>
-      <w:r>
-        <w:t xml:space="preserve">, and so on</w:t>
+        <w:t xml:space="preserve">is symmetric.</w:t>
       </w:r>
     </w:p>
     <w:p>
@@ -6991,21 +6071,7 @@
         </m:d>
       </m:oMath>
       <w:r>
-        <w:t xml:space="preserve">. Each element is (row</w:t>
-      </w:r>
-      <w:r>
-        <w:t xml:space="preserve"> </w:t>
-      </w:r>
-      <m:oMath>
-        <m:r>
-          <m:t>j</m:t>
-        </m:r>
-      </m:oMath>
-      <w:r>
-        <w:t xml:space="preserve"> </w:t>
-      </w:r>
-      <w:r>
-        <w:t xml:space="preserve">of</w:t>
+        <w:t xml:space="preserve">. Each element is a row of</w:t>
       </w:r>
       <w:r>
         <w:t xml:space="preserve"> </w:t>
@@ -7022,7 +6088,10 @@
         </m:r>
       </m:oMath>
       <w:r>
-        <w:t xml:space="preserve">) times the Trade column, that is, the sum of each variable multiplied by Trade:</w:t>
+        <w:t xml:space="preserve"> </w:t>
+      </w:r>
+      <w:r>
+        <w:t xml:space="preserve">times the Trade column:</w:t>
       </w:r>
     </w:p>
     <w:p>
@@ -9748,88 +8817,17 @@
         </m:sSub>
       </m:oMath>
       <w:r>
-        <w:t xml:space="preserve"> </w:t>
-      </w:r>
-      <w:r>
         <w:rPr>
           <w:iCs/>
           <w:i/>
         </w:rPr>
-        <w:t xml:space="preserve">(method of least squares).</w:t>
+        <w:t xml:space="preserve">.</w:t>
       </w:r>
       <w:r>
         <w:t xml:space="preserve"> </w:t>
       </w:r>
       <w:r>
-        <w:t xml:space="preserve">The residual is</w:t>
-      </w:r>
-      <w:r>
-        <w:t xml:space="preserve"> </w:t>
-      </w:r>
-      <m:oMath>
-        <m:sSub>
-          <m:e>
-            <m:r>
-              <m:t>e</m:t>
-            </m:r>
-          </m:e>
-          <m:sub>
-            <m:r>
-              <m:t>i</m:t>
-            </m:r>
-          </m:sub>
-        </m:sSub>
-        <m:r>
-          <m:rPr>
-            <m:sty m:val="p"/>
-          </m:rPr>
-          <m:t>=</m:t>
-        </m:r>
-        <m:sSub>
-          <m:e>
-            <m:r>
-              <m:t>Y</m:t>
-            </m:r>
-          </m:e>
-          <m:sub>
-            <m:r>
-              <m:t>i</m:t>
-            </m:r>
-          </m:sub>
-        </m:sSub>
-        <m:r>
-          <m:rPr>
-            <m:sty m:val="p"/>
-          </m:rPr>
-          <m:t>−</m:t>
-        </m:r>
-        <m:sSub>
-          <m:e>
-            <m:r>
-              <m:t>b</m:t>
-            </m:r>
-          </m:e>
-          <m:sub>
-            <m:r>
-              <m:t>1</m:t>
-            </m:r>
-          </m:sub>
-        </m:sSub>
-        <m:sSub>
-          <m:e>
-            <m:r>
-              <m:t>X</m:t>
-            </m:r>
-          </m:e>
-          <m:sub>
-            <m:r>
-              <m:t>i</m:t>
-            </m:r>
-          </m:sub>
-        </m:sSub>
-      </m:oMath>
-      <w:r>
-        <w:t xml:space="preserve">, so</w:t>
+        <w:t xml:space="preserve">Minimize the residual sum of squares:</w:t>
       </w:r>
     </w:p>
     <w:p>
@@ -10006,7 +9004,7 @@
         </w:numPr>
       </w:pPr>
       <w:r>
-        <w:t xml:space="preserve">Setting the first-order condition to zero:</w:t>
+        <w:t xml:space="preserve">Set the first-order condition to zero:</w:t>
       </w:r>
     </w:p>
     <w:p>
@@ -10356,60 +9354,6 @@
           </m:f>
         </m:oMath>
       </m:oMathPara>
-    </w:p>
-    <w:p>
-      <w:pPr>
-        <w:numPr>
-          <w:ilvl w:val="0"/>
-          <w:numId w:val="1000"/>
-        </w:numPr>
-      </w:pPr>
-      <w:r>
-        <w:t xml:space="preserve">The second derivative,</w:t>
-      </w:r>
-      <w:r>
-        <w:t xml:space="preserve"> </w:t>
-      </w:r>
-      <m:oMath>
-        <m:r>
-          <m:t>2</m:t>
-        </m:r>
-        <m:r>
-          <m:rPr>
-            <m:sty m:val="p"/>
-          </m:rPr>
-          <m:t>∑</m:t>
-        </m:r>
-        <m:sSubSup>
-          <m:e>
-            <m:r>
-              <m:t>X</m:t>
-            </m:r>
-          </m:e>
-          <m:sub>
-            <m:r>
-              <m:t>i</m:t>
-            </m:r>
-          </m:sub>
-          <m:sup>
-            <m:r>
-              <m:t>2</m:t>
-            </m:r>
-          </m:sup>
-        </m:sSubSup>
-        <m:r>
-          <m:rPr>
-            <m:sty m:val="p"/>
-          </m:rPr>
-          <m:t>&gt;</m:t>
-        </m:r>
-        <m:r>
-          <m:t>0</m:t>
-        </m:r>
-      </m:oMath>
-      <w:r>
-        <w:t xml:space="preserve">, confirms this is a minimum. Without the constant there is only one normal equation, and the formula uses raw sums rather than deviations from the mean.</w:t>
-      </w:r>
     </w:p>
     <w:p>
       <w:pPr>
@@ -10764,7 +9708,7 @@
         </w:numPr>
       </w:pPr>
       <w:r>
-        <w:t xml:space="preserve">Since the</w:t>
+        <w:t xml:space="preserve">The</w:t>
       </w:r>
       <w:r>
         <w:t xml:space="preserve"> </w:t>
@@ -10829,7 +9773,7 @@
         </m:r>
       </m:oMath>
       <w:r>
-        <w:t xml:space="preserve">,</w:t>
+        <w:t xml:space="preserve">. So</w:t>
       </w:r>
       <w:r>
         <w:t xml:space="preserve"> </w:t>
@@ -10887,10 +9831,7 @@
         </m:sSub>
       </m:oMath>
       <w:r>
-        <w:t xml:space="preserve"> </w:t>
-      </w:r>
-      <w:r>
-        <w:t xml:space="preserve">(unbiased). Then</w:t>
+        <w:t xml:space="preserve">. Then</w:t>
       </w:r>
     </w:p>
     <w:p>
@@ -11142,7 +10083,7 @@
         </w:numPr>
       </w:pPr>
       <w:r>
-        <w:t xml:space="preserve">Because the</w:t>
+        <w:t xml:space="preserve">The</w:t>
       </w:r>
       <w:r>
         <w:t xml:space="preserve"> </w:t>
@@ -11165,128 +10106,12 @@
         <w:t xml:space="preserve"> </w:t>
       </w:r>
       <w:r>
-        <w:t xml:space="preserve">are independent,</w:t>
+        <w:t xml:space="preserve">are independent with variance</w:t>
       </w:r>
       <w:r>
         <w:t xml:space="preserve"> </w:t>
       </w:r>
       <m:oMath>
-        <m:r>
-          <m:t>E</m:t>
-        </m:r>
-        <m:d>
-          <m:dPr>
-            <m:begChr m:val="("/>
-            <m:sepChr m:val=""/>
-            <m:endChr m:val=")"/>
-            <m:grow/>
-          </m:dPr>
-          <m:e>
-            <m:sSub>
-              <m:e>
-                <m:r>
-                  <m:t>ε</m:t>
-                </m:r>
-              </m:e>
-              <m:sub>
-                <m:r>
-                  <m:t>i</m:t>
-                </m:r>
-              </m:sub>
-            </m:sSub>
-            <m:sSub>
-              <m:e>
-                <m:r>
-                  <m:t>ε</m:t>
-                </m:r>
-              </m:e>
-              <m:sub>
-                <m:r>
-                  <m:t>j</m:t>
-                </m:r>
-              </m:sub>
-            </m:sSub>
-          </m:e>
-        </m:d>
-        <m:r>
-          <m:rPr>
-            <m:sty m:val="p"/>
-          </m:rPr>
-          <m:t>=</m:t>
-        </m:r>
-        <m:r>
-          <m:t>0</m:t>
-        </m:r>
-      </m:oMath>
-      <w:r>
-        <w:t xml:space="preserve"> </w:t>
-      </w:r>
-      <w:r>
-        <w:t xml:space="preserve">for</w:t>
-      </w:r>
-      <w:r>
-        <w:t xml:space="preserve"> </w:t>
-      </w:r>
-      <m:oMath>
-        <m:r>
-          <m:t>i</m:t>
-        </m:r>
-        <m:r>
-          <m:rPr>
-            <m:sty m:val="p"/>
-          </m:rPr>
-          <m:t>≠</m:t>
-        </m:r>
-        <m:r>
-          <m:t>j</m:t>
-        </m:r>
-      </m:oMath>
-      <w:r>
-        <w:t xml:space="preserve"> </w:t>
-      </w:r>
-      <w:r>
-        <w:t xml:space="preserve">and</w:t>
-      </w:r>
-      <w:r>
-        <w:t xml:space="preserve"> </w:t>
-      </w:r>
-      <m:oMath>
-        <m:r>
-          <m:t>E</m:t>
-        </m:r>
-        <m:d>
-          <m:dPr>
-            <m:begChr m:val="("/>
-            <m:sepChr m:val=""/>
-            <m:endChr m:val=")"/>
-            <m:grow/>
-          </m:dPr>
-          <m:e>
-            <m:sSubSup>
-              <m:e>
-                <m:r>
-                  <m:t>ε</m:t>
-                </m:r>
-              </m:e>
-              <m:sub>
-                <m:r>
-                  <m:t>i</m:t>
-                </m:r>
-              </m:sub>
-              <m:sup>
-                <m:r>
-                  <m:t>2</m:t>
-                </m:r>
-              </m:sup>
-            </m:sSubSup>
-          </m:e>
-        </m:d>
-        <m:r>
-          <m:rPr>
-            <m:sty m:val="p"/>
-          </m:rPr>
-          <m:t>=</m:t>
-        </m:r>
         <m:sSup>
           <m:e>
             <m:r>
@@ -11301,7 +10126,7 @@
         </m:sSup>
       </m:oMath>
       <w:r>
-        <w:t xml:space="preserve">, so</w:t>
+        <w:t xml:space="preserve">. So</w:t>
       </w:r>
       <w:r>
         <w:t xml:space="preserve"> </w:t>
@@ -11412,7 +10237,7 @@
         </m:sSubSup>
       </m:oMath>
       <w:r>
-        <w:t xml:space="preserve">. Therefore</w:t>
+        <w:t xml:space="preserve">. Therefore:</w:t>
       </w:r>
     </w:p>
     <w:p>
@@ -11621,12 +10446,6 @@
       <w:r>
         <w:t xml:space="preserve"> </w:t>
       </w:r>
-      <w:r>
-        <w:t xml:space="preserve">Since</w:t>
-      </w:r>
-      <w:r>
-        <w:t xml:space="preserve"> </w:t>
-      </w:r>
       <m:oMath>
         <m:sSup>
           <m:e>
@@ -11645,24 +10464,50 @@
         <w:t xml:space="preserve"> </w:t>
       </w:r>
       <w:r>
-        <w:t xml:space="preserve">is unknown, replace it with its unbiased estimate from the residuals. Only one parameter is estimated (</w:t>
+        <w:t xml:space="preserve">is unknown. It is estimated by</w:t>
+      </w:r>
+      <w:r>
+        <w:t xml:space="preserve"> </w:t>
       </w:r>
       <m:oMath>
-        <m:r>
-          <m:t>p</m:t>
+        <m:sSup>
+          <m:e>
+            <m:r>
+              <m:t>s</m:t>
+            </m:r>
+          </m:e>
+          <m:sup>
+            <m:r>
+              <m:t>2</m:t>
+            </m:r>
+          </m:sup>
+        </m:sSup>
+      </m:oMath>
+      <w:r>
+        <w:t xml:space="preserve">, with</w:t>
+      </w:r>
+      <w:r>
+        <w:t xml:space="preserve"> </w:t>
+      </w:r>
+      <m:oMath>
+        <m:r>
+          <m:t>n</m:t>
         </m:r>
         <m:r>
           <m:rPr>
             <m:sty m:val="p"/>
           </m:rPr>
-          <m:t>=</m:t>
+          <m:t>−</m:t>
         </m:r>
         <m:r>
           <m:t>1</m:t>
         </m:r>
       </m:oMath>
       <w:r>
-        <w:t xml:space="preserve">, see Item 4), so</w:t>
+        <w:t xml:space="preserve"> </w:t>
+      </w:r>
+      <w:r>
+        <w:t xml:space="preserve">degrees of freedom:</w:t>
       </w:r>
     </w:p>
     <w:p>
@@ -12259,7 +11104,7 @@
         </w:numPr>
       </w:pPr>
       <w:r>
-        <w:t xml:space="preserve">Since the</w:t>
+        <w:t xml:space="preserve">The</w:t>
       </w:r>
       <w:r>
         <w:t xml:space="preserve"> </w:t>
@@ -12324,10 +11169,7 @@
         </m:d>
       </m:oMath>
       <w:r>
-        <w:t xml:space="preserve"> </w:t>
-      </w:r>
-      <w:r>
-        <w:t xml:space="preserve">and</w:t>
+        <w:t xml:space="preserve">, and</w:t>
       </w:r>
       <w:r>
         <w:t xml:space="preserve"> </w:t>
@@ -12351,24 +11193,6 @@
             </m:r>
           </m:sup>
         </m:sSup>
-        <m:r>
-          <m:rPr>
-            <m:sty m:val="p"/>
-          </m:rPr>
-          <m:t>=</m:t>
-        </m:r>
-        <m:r>
-          <m:t>ε</m:t>
-        </m:r>
-        <m:r>
-          <m:rPr>
-            <m:sty m:val="p"/>
-          </m:rPr>
-          <m:t>′</m:t>
-        </m:r>
-        <m:r>
-          <m:t>ε</m:t>
-        </m:r>
         <m:r>
           <m:rPr>
             <m:sty m:val="p"/>
@@ -12433,7 +11257,7 @@
         </m:d>
       </m:oMath>
       <w:r>
-        <w:t xml:space="preserve">, the likelihood and the log-likelihood are</w:t>
+        <w:t xml:space="preserve">. The likelihood and the log-likelihood are:</w:t>
       </w:r>
     </w:p>
     <w:p>
@@ -13152,116 +11976,7 @@
         </w:numPr>
       </w:pPr>
       <w:r>
-        <w:t xml:space="preserve">This is the same as the OLS estimator:</w:t>
-      </w:r>
-      <w:r>
-        <w:t xml:space="preserve"> </w:t>
-      </w:r>
-      <m:oMath>
-        <m:r>
-          <m:t>β</m:t>
-        </m:r>
-      </m:oMath>
-      <w:r>
-        <w:t xml:space="preserve"> </w:t>
-      </w:r>
-      <w:r>
-        <w:t xml:space="preserve">appears only in the last term of</w:t>
-      </w:r>
-      <w:r>
-        <w:t xml:space="preserve"> </w:t>
-      </w:r>
-      <m:oMath>
-        <m:r>
-          <m:rPr>
-            <m:sty m:val="p"/>
-          </m:rPr>
-          <m:t>ln</m:t>
-        </m:r>
-        <m:r>
-          <m:t>L</m:t>
-        </m:r>
-      </m:oMath>
-      <w:r>
-        <w:t xml:space="preserve">, so maximizing</w:t>
-      </w:r>
-      <w:r>
-        <w:t xml:space="preserve"> </w:t>
-      </w:r>
-      <m:oMath>
-        <m:r>
-          <m:t>L</m:t>
-        </m:r>
-      </m:oMath>
-      <w:r>
-        <w:t xml:space="preserve"> </w:t>
-      </w:r>
-      <w:r>
-        <w:t xml:space="preserve">is the same as minimizing</w:t>
-      </w:r>
-      <w:r>
-        <w:t xml:space="preserve"> </w:t>
-      </w:r>
-      <m:oMath>
-        <m:d>
-          <m:dPr>
-            <m:begChr m:val="("/>
-            <m:sepChr m:val=""/>
-            <m:endChr m:val=")"/>
-            <m:grow/>
-          </m:dPr>
-          <m:e>
-            <m:r>
-              <m:t>Y</m:t>
-            </m:r>
-            <m:r>
-              <m:rPr>
-                <m:sty m:val="p"/>
-              </m:rPr>
-              <m:t>−</m:t>
-            </m:r>
-            <m:r>
-              <m:t>X</m:t>
-            </m:r>
-            <m:r>
-              <m:t>β</m:t>
-            </m:r>
-          </m:e>
-        </m:d>
-        <m:r>
-          <m:rPr>
-            <m:sty m:val="p"/>
-          </m:rPr>
-          <m:t>′</m:t>
-        </m:r>
-        <m:d>
-          <m:dPr>
-            <m:begChr m:val="("/>
-            <m:sepChr m:val=""/>
-            <m:endChr m:val=")"/>
-            <m:grow/>
-          </m:dPr>
-          <m:e>
-            <m:r>
-              <m:t>Y</m:t>
-            </m:r>
-            <m:r>
-              <m:rPr>
-                <m:sty m:val="p"/>
-              </m:rPr>
-              <m:t>−</m:t>
-            </m:r>
-            <m:r>
-              <m:t>X</m:t>
-            </m:r>
-            <m:r>
-              <m:t>β</m:t>
-            </m:r>
-          </m:e>
-        </m:d>
-      </m:oMath>
-      <w:r>
-        <w:t xml:space="preserve">.</w:t>
+        <w:t xml:space="preserve">This is the same as the least squares estimator.</w:t>
       </w:r>
     </w:p>
     <w:p>
@@ -14039,22 +12754,16 @@
           <w:numId w:val="1000"/>
         </w:numPr>
       </w:pPr>
-      <w:r>
-        <w:t xml:space="preserve">because</w:t>
-      </w:r>
+      <m:oMath>
+        <m:r>
+          <m:t>X</m:t>
+        </m:r>
+      </m:oMath>
       <w:r>
         <w:t xml:space="preserve"> </w:t>
       </w:r>
-      <m:oMath>
-        <m:r>
-          <m:t>X</m:t>
-        </m:r>
-      </m:oMath>
-      <w:r>
-        <w:t xml:space="preserve"> </w:t>
-      </w:r>
-      <w:r>
-        <w:t xml:space="preserve">is a matrix of constants and</w:t>
+      <w:r>
+        <w:t xml:space="preserve">is fixed and</w:t>
       </w:r>
       <w:r>
         <w:t xml:space="preserve"> </w:t>
@@ -14087,25 +12796,49 @@
         </m:r>
       </m:oMath>
       <w:r>
-        <w:t xml:space="preserve">. Its variance is</w:t>
+        <w:t xml:space="preserve">. So</w:t>
       </w:r>
       <w:r>
         <w:t xml:space="preserve"> </w:t>
       </w:r>
       <m:oMath>
-        <m:r>
-          <m:rPr>
-            <m:nor/>
-          </m:rPr>
-          <m:t>Var</m:t>
-        </m:r>
-        <m:d>
-          <m:dPr>
-            <m:begChr m:val="("/>
-            <m:sepChr m:val=""/>
-            <m:endChr m:val=")"/>
-            <m:grow/>
-          </m:dPr>
+        <m:acc>
+          <m:accPr>
+            <m:chr m:val="̃"/>
+          </m:accPr>
+          <m:e>
+            <m:r>
+              <m:t>β</m:t>
+            </m:r>
+          </m:e>
+        </m:acc>
+      </m:oMath>
+      <w:r>
+        <w:t xml:space="preserve"> </w:t>
+      </w:r>
+      <w:r>
+        <w:t xml:space="preserve">is unbiased.</w:t>
+      </w:r>
+    </w:p>
+    <w:p>
+      <w:pPr>
+        <w:numPr>
+          <w:ilvl w:val="0"/>
+          <w:numId w:val="1000"/>
+        </w:numPr>
+      </w:pPr>
+      <w:r>
+        <w:rPr>
+          <w:iCs/>
+          <w:i/>
+        </w:rPr>
+        <w:t xml:space="preserve">Is</w:t>
+      </w:r>
+      <w:r>
+        <w:t xml:space="preserve"> </w:t>
+      </w:r>
+      <m:oMath>
+        <m:sSup>
           <m:e>
             <m:acc>
               <m:accPr>
@@ -14113,17 +12846,96 @@
               </m:accPr>
               <m:e>
                 <m:r>
-                  <m:t>β</m:t>
+                  <m:t>σ</m:t>
                 </m:r>
               </m:e>
             </m:acc>
           </m:e>
-        </m:d>
+          <m:sup>
+            <m:r>
+              <m:t>2</m:t>
+            </m:r>
+          </m:sup>
+        </m:sSup>
+      </m:oMath>
+      <w:r>
+        <w:t xml:space="preserve"> </w:t>
+      </w:r>
+      <w:r>
+        <w:rPr>
+          <w:iCs/>
+          <w:i/>
+        </w:rPr>
+        <w:t xml:space="preserve">unbiased?</w:t>
+      </w:r>
+      <w:r>
+        <w:t xml:space="preserve"> </w:t>
+      </w:r>
+      <w:r>
+        <w:rPr>
+          <w:bCs/>
+          <w:b/>
+        </w:rPr>
+        <w:t xml:space="preserve">No.</w:t>
+      </w:r>
+    </w:p>
+    <w:p>
+      <w:pPr>
+        <w:numPr>
+          <w:ilvl w:val="0"/>
+          <w:numId w:val="1000"/>
+        </w:numPr>
+      </w:pPr>
+      <w:r>
+        <w:t xml:space="preserve">The residuals are</w:t>
+      </w:r>
+      <w:r>
+        <w:t xml:space="preserve"> </w:t>
+      </w:r>
+      <m:oMath>
+        <m:r>
+          <m:t>e</m:t>
+        </m:r>
         <m:r>
           <m:rPr>
             <m:sty m:val="p"/>
           </m:rPr>
           <m:t>=</m:t>
+        </m:r>
+        <m:r>
+          <m:t>M</m:t>
+        </m:r>
+        <m:r>
+          <m:t>ε</m:t>
+        </m:r>
+      </m:oMath>
+      <w:r>
+        <w:t xml:space="preserve">, where</w:t>
+      </w:r>
+      <w:r>
+        <w:t xml:space="preserve"> </w:t>
+      </w:r>
+      <m:oMath>
+        <m:r>
+          <m:t>M</m:t>
+        </m:r>
+        <m:r>
+          <m:rPr>
+            <m:sty m:val="p"/>
+          </m:rPr>
+          <m:t>=</m:t>
+        </m:r>
+        <m:r>
+          <m:t>I</m:t>
+        </m:r>
+        <m:r>
+          <m:rPr>
+            <m:sty m:val="p"/>
+          </m:rPr>
+          <m:t>−</m:t>
+        </m:r>
+        <m:r>
+          <m:t>X</m:t>
         </m:r>
         <m:sSup>
           <m:e>
@@ -14171,392 +12983,48 @@
           </m:rPr>
           <m:t>′</m:t>
         </m:r>
-        <m:d>
-          <m:dPr>
-            <m:begChr m:val="("/>
-            <m:sepChr m:val=""/>
-            <m:endChr m:val=")"/>
-            <m:grow/>
-          </m:dPr>
-          <m:e>
-            <m:sSup>
-              <m:e>
-                <m:r>
-                  <m:t>σ</m:t>
-                </m:r>
-              </m:e>
-              <m:sup>
-                <m:r>
-                  <m:t>2</m:t>
-                </m:r>
-              </m:sup>
-            </m:sSup>
-            <m:r>
-              <m:t>I</m:t>
-            </m:r>
-          </m:e>
-        </m:d>
-        <m:r>
-          <m:t>X</m:t>
-        </m:r>
-        <m:sSup>
-          <m:e>
-            <m:d>
-              <m:dPr>
-                <m:begChr m:val="("/>
-                <m:sepChr m:val=""/>
-                <m:endChr m:val=")"/>
-                <m:grow/>
-              </m:dPr>
-              <m:e>
-                <m:r>
-                  <m:t>X</m:t>
-                </m:r>
-                <m:r>
-                  <m:rPr>
-                    <m:sty m:val="p"/>
-                  </m:rPr>
-                  <m:t>′</m:t>
-                </m:r>
-                <m:r>
-                  <m:t>X</m:t>
-                </m:r>
-              </m:e>
-            </m:d>
-          </m:e>
-          <m:sup>
-            <m:r>
-              <m:rPr>
-                <m:sty m:val="p"/>
-              </m:rPr>
-              <m:t>−</m:t>
-            </m:r>
-            <m:r>
-              <m:t>1</m:t>
-            </m:r>
-          </m:sup>
-        </m:sSup>
+      </m:oMath>
+      <w:r>
+        <w:t xml:space="preserve">.</w:t>
+      </w:r>
+      <w:r>
+        <w:t xml:space="preserve"> </w:t>
+      </w:r>
+      <m:oMath>
+        <m:r>
+          <m:t>M</m:t>
+        </m:r>
+      </m:oMath>
+      <w:r>
+        <w:t xml:space="preserve"> </w:t>
+      </w:r>
+      <w:r>
+        <w:t xml:space="preserve">is symmetric and idempotent. So</w:t>
+      </w:r>
+      <w:r>
+        <w:t xml:space="preserve"> </w:t>
+      </w:r>
+      <m:oMath>
+        <m:r>
+          <m:t>e</m:t>
+        </m:r>
+        <m:r>
+          <m:rPr>
+            <m:sty m:val="p"/>
+          </m:rPr>
+          <m:t>′</m:t>
+        </m:r>
+        <m:r>
+          <m:t>e</m:t>
+        </m:r>
         <m:r>
           <m:rPr>
             <m:sty m:val="p"/>
           </m:rPr>
           <m:t>=</m:t>
         </m:r>
-        <m:sSup>
-          <m:e>
-            <m:r>
-              <m:t>σ</m:t>
-            </m:r>
-          </m:e>
-          <m:sup>
-            <m:r>
-              <m:t>2</m:t>
-            </m:r>
-          </m:sup>
-        </m:sSup>
-        <m:sSup>
-          <m:e>
-            <m:d>
-              <m:dPr>
-                <m:begChr m:val="("/>
-                <m:sepChr m:val=""/>
-                <m:endChr m:val=")"/>
-                <m:grow/>
-              </m:dPr>
-              <m:e>
-                <m:r>
-                  <m:t>X</m:t>
-                </m:r>
-                <m:r>
-                  <m:rPr>
-                    <m:sty m:val="p"/>
-                  </m:rPr>
-                  <m:t>′</m:t>
-                </m:r>
-                <m:r>
-                  <m:t>X</m:t>
-                </m:r>
-              </m:e>
-            </m:d>
-          </m:e>
-          <m:sup>
-            <m:r>
-              <m:rPr>
-                <m:sty m:val="p"/>
-              </m:rPr>
-              <m:t>−</m:t>
-            </m:r>
-            <m:r>
-              <m:t>1</m:t>
-            </m:r>
-          </m:sup>
-        </m:sSup>
-      </m:oMath>
-      <w:r>
-        <w:t xml:space="preserve">.</w:t>
-      </w:r>
-    </w:p>
-    <w:p>
-      <w:pPr>
-        <w:numPr>
-          <w:ilvl w:val="0"/>
-          <w:numId w:val="1000"/>
-        </w:numPr>
-      </w:pPr>
-      <w:r>
-        <w:rPr>
-          <w:iCs/>
-          <w:i/>
-        </w:rPr>
-        <w:t xml:space="preserve">Is</w:t>
-      </w:r>
-      <w:r>
-        <w:t xml:space="preserve"> </w:t>
-      </w:r>
-      <m:oMath>
-        <m:sSup>
-          <m:e>
-            <m:acc>
-              <m:accPr>
-                <m:chr m:val="̃"/>
-              </m:accPr>
-              <m:e>
-                <m:r>
-                  <m:t>σ</m:t>
-                </m:r>
-              </m:e>
-            </m:acc>
-          </m:e>
-          <m:sup>
-            <m:r>
-              <m:t>2</m:t>
-            </m:r>
-          </m:sup>
-        </m:sSup>
-      </m:oMath>
-      <w:r>
-        <w:t xml:space="preserve"> </w:t>
-      </w:r>
-      <w:r>
-        <w:rPr>
-          <w:iCs/>
-          <w:i/>
-        </w:rPr>
-        <w:t xml:space="preserve">unbiased?</w:t>
-      </w:r>
-      <w:r>
-        <w:t xml:space="preserve"> </w:t>
-      </w:r>
-      <w:r>
-        <w:rPr>
-          <w:bCs/>
-          <w:b/>
-        </w:rPr>
-        <w:t xml:space="preserve">No.</w:t>
-      </w:r>
-    </w:p>
-    <w:p>
-      <w:pPr>
-        <w:numPr>
-          <w:ilvl w:val="0"/>
-          <w:numId w:val="1000"/>
-        </w:numPr>
-      </w:pPr>
-      <w:r>
-        <w:t xml:space="preserve">The residuals are</w:t>
-      </w:r>
-      <w:r>
-        <w:t xml:space="preserve"> </w:t>
-      </w:r>
-      <m:oMath>
-        <m:r>
-          <m:t>e</m:t>
-        </m:r>
-        <m:r>
-          <m:rPr>
-            <m:sty m:val="p"/>
-          </m:rPr>
-          <m:t>=</m:t>
-        </m:r>
-        <m:r>
-          <m:t>Y</m:t>
-        </m:r>
-        <m:r>
-          <m:rPr>
-            <m:sty m:val="p"/>
-          </m:rPr>
-          <m:t>−</m:t>
-        </m:r>
-        <m:r>
-          <m:t>X</m:t>
-        </m:r>
-        <m:acc>
-          <m:accPr>
-            <m:chr m:val="̃"/>
-          </m:accPr>
-          <m:e>
-            <m:r>
-              <m:t>β</m:t>
-            </m:r>
-          </m:e>
-        </m:acc>
-        <m:r>
-          <m:rPr>
-            <m:sty m:val="p"/>
-          </m:rPr>
-          <m:t>=</m:t>
-        </m:r>
-        <m:d>
-          <m:dPr>
-            <m:begChr m:val="["/>
-            <m:sepChr m:val=""/>
-            <m:endChr m:val="]"/>
-            <m:grow/>
-          </m:dPr>
-          <m:e>
-            <m:r>
-              <m:t>I</m:t>
-            </m:r>
-            <m:r>
-              <m:rPr>
-                <m:sty m:val="p"/>
-              </m:rPr>
-              <m:t>−</m:t>
-            </m:r>
-            <m:r>
-              <m:t>X</m:t>
-            </m:r>
-            <m:sSup>
-              <m:e>
-                <m:d>
-                  <m:dPr>
-                    <m:begChr m:val="("/>
-                    <m:sepChr m:val=""/>
-                    <m:endChr m:val=")"/>
-                    <m:grow/>
-                  </m:dPr>
-                  <m:e>
-                    <m:r>
-                      <m:t>X</m:t>
-                    </m:r>
-                    <m:r>
-                      <m:rPr>
-                        <m:sty m:val="p"/>
-                      </m:rPr>
-                      <m:t>′</m:t>
-                    </m:r>
-                    <m:r>
-                      <m:t>X</m:t>
-                    </m:r>
-                  </m:e>
-                </m:d>
-              </m:e>
-              <m:sup>
-                <m:r>
-                  <m:rPr>
-                    <m:sty m:val="p"/>
-                  </m:rPr>
-                  <m:t>−</m:t>
-                </m:r>
-                <m:r>
-                  <m:t>1</m:t>
-                </m:r>
-              </m:sup>
-            </m:sSup>
-            <m:r>
-              <m:t>X</m:t>
-            </m:r>
-            <m:r>
-              <m:rPr>
-                <m:sty m:val="p"/>
-              </m:rPr>
-              <m:t>′</m:t>
-            </m:r>
-          </m:e>
-        </m:d>
-        <m:r>
-          <m:t>Y</m:t>
-        </m:r>
-        <m:r>
-          <m:rPr>
-            <m:sty m:val="p"/>
-          </m:rPr>
-          <m:t>=</m:t>
-        </m:r>
-        <m:r>
-          <m:t>M</m:t>
-        </m:r>
-        <m:r>
-          <m:t>Y</m:t>
-        </m:r>
-      </m:oMath>
-      <w:r>
-        <w:t xml:space="preserve">, where</w:t>
-      </w:r>
-      <w:r>
-        <w:t xml:space="preserve"> </w:t>
-      </w:r>
-      <m:oMath>
-        <m:r>
-          <m:t>M</m:t>
-        </m:r>
-        <m:r>
-          <m:rPr>
-            <m:sty m:val="p"/>
-          </m:rPr>
-          <m:t>=</m:t>
-        </m:r>
-        <m:r>
-          <m:t>I</m:t>
-        </m:r>
-        <m:r>
-          <m:rPr>
-            <m:sty m:val="p"/>
-          </m:rPr>
-          <m:t>−</m:t>
-        </m:r>
-        <m:r>
-          <m:t>X</m:t>
-        </m:r>
-        <m:sSup>
-          <m:e>
-            <m:d>
-              <m:dPr>
-                <m:begChr m:val="("/>
-                <m:sepChr m:val=""/>
-                <m:endChr m:val=")"/>
-                <m:grow/>
-              </m:dPr>
-              <m:e>
-                <m:r>
-                  <m:t>X</m:t>
-                </m:r>
-                <m:r>
-                  <m:rPr>
-                    <m:sty m:val="p"/>
-                  </m:rPr>
-                  <m:t>′</m:t>
-                </m:r>
-                <m:r>
-                  <m:t>X</m:t>
-                </m:r>
-              </m:e>
-            </m:d>
-          </m:e>
-          <m:sup>
-            <m:r>
-              <m:rPr>
-                <m:sty m:val="p"/>
-              </m:rPr>
-              <m:t>−</m:t>
-            </m:r>
-            <m:r>
-              <m:t>1</m:t>
-            </m:r>
-          </m:sup>
-        </m:sSup>
-        <m:r>
-          <m:t>X</m:t>
+        <m:r>
+          <m:t>ε</m:t>
         </m:r>
         <m:r>
           <m:rPr>
@@ -14564,202 +13032,15 @@
           </m:rPr>
           <m:t>′</m:t>
         </m:r>
+        <m:r>
+          <m:t>M</m:t>
+        </m:r>
+        <m:r>
+          <m:t>ε</m:t>
+        </m:r>
       </m:oMath>
       <w:r>
-        <w:t xml:space="preserve"> </w:t>
-      </w:r>
-      <w:r>
-        <w:t xml:space="preserve">is symmetric (</w:t>
-      </w:r>
-      <m:oMath>
-        <m:r>
-          <m:t>M</m:t>
-        </m:r>
-        <m:r>
-          <m:rPr>
-            <m:sty m:val="p"/>
-          </m:rPr>
-          <m:t>′</m:t>
-        </m:r>
-        <m:r>
-          <m:rPr>
-            <m:sty m:val="p"/>
-          </m:rPr>
-          <m:t>=</m:t>
-        </m:r>
-        <m:r>
-          <m:t>M</m:t>
-        </m:r>
-      </m:oMath>
-      <w:r>
-        <w:t xml:space="preserve">), idempotent (</w:t>
-      </w:r>
-      <m:oMath>
-        <m:r>
-          <m:t>M</m:t>
-        </m:r>
-        <m:r>
-          <m:t>M</m:t>
-        </m:r>
-        <m:r>
-          <m:rPr>
-            <m:sty m:val="p"/>
-          </m:rPr>
-          <m:t>=</m:t>
-        </m:r>
-        <m:r>
-          <m:t>M</m:t>
-        </m:r>
-      </m:oMath>
-      <w:r>
-        <w:t xml:space="preserve">) and satisfies</w:t>
-      </w:r>
-      <w:r>
-        <w:t xml:space="preserve"> </w:t>
-      </w:r>
-      <m:oMath>
-        <m:r>
-          <m:t>M</m:t>
-        </m:r>
-        <m:r>
-          <m:t>X</m:t>
-        </m:r>
-        <m:r>
-          <m:rPr>
-            <m:sty m:val="p"/>
-          </m:rPr>
-          <m:t>=</m:t>
-        </m:r>
-        <m:r>
-          <m:t>0</m:t>
-        </m:r>
-      </m:oMath>
-      <w:r>
-        <w:t xml:space="preserve">. Hence</w:t>
-      </w:r>
-      <w:r>
-        <w:t xml:space="preserve"> </w:t>
-      </w:r>
-      <m:oMath>
-        <m:r>
-          <m:t>e</m:t>
-        </m:r>
-        <m:r>
-          <m:rPr>
-            <m:sty m:val="p"/>
-          </m:rPr>
-          <m:t>=</m:t>
-        </m:r>
-        <m:r>
-          <m:t>M</m:t>
-        </m:r>
-        <m:d>
-          <m:dPr>
-            <m:begChr m:val="("/>
-            <m:sepChr m:val=""/>
-            <m:endChr m:val=")"/>
-            <m:grow/>
-          </m:dPr>
-          <m:e>
-            <m:r>
-              <m:t>X</m:t>
-            </m:r>
-            <m:r>
-              <m:t>β</m:t>
-            </m:r>
-            <m:r>
-              <m:rPr>
-                <m:sty m:val="p"/>
-              </m:rPr>
-              <m:t>+</m:t>
-            </m:r>
-            <m:r>
-              <m:t>ε</m:t>
-            </m:r>
-          </m:e>
-        </m:d>
-        <m:r>
-          <m:rPr>
-            <m:sty m:val="p"/>
-          </m:rPr>
-          <m:t>=</m:t>
-        </m:r>
-        <m:r>
-          <m:t>M</m:t>
-        </m:r>
-        <m:r>
-          <m:t>ε</m:t>
-        </m:r>
-      </m:oMath>
-      <w:r>
-        <w:t xml:space="preserve"> </w:t>
-      </w:r>
-      <w:r>
-        <w:t xml:space="preserve">and</w:t>
-      </w:r>
-      <w:r>
-        <w:t xml:space="preserve"> </w:t>
-      </w:r>
-      <m:oMath>
-        <m:r>
-          <m:t>e</m:t>
-        </m:r>
-        <m:r>
-          <m:rPr>
-            <m:sty m:val="p"/>
-          </m:rPr>
-          <m:t>′</m:t>
-        </m:r>
-        <m:r>
-          <m:t>e</m:t>
-        </m:r>
-        <m:r>
-          <m:rPr>
-            <m:sty m:val="p"/>
-          </m:rPr>
-          <m:t>=</m:t>
-        </m:r>
-        <m:r>
-          <m:t>ε</m:t>
-        </m:r>
-        <m:r>
-          <m:rPr>
-            <m:sty m:val="p"/>
-          </m:rPr>
-          <m:t>′</m:t>
-        </m:r>
-        <m:r>
-          <m:t>M</m:t>
-        </m:r>
-        <m:r>
-          <m:t>ε</m:t>
-        </m:r>
-      </m:oMath>
-      <w:r>
-        <w:t xml:space="preserve">. Since</w:t>
-      </w:r>
-      <w:r>
-        <w:t xml:space="preserve"> </w:t>
-      </w:r>
-      <m:oMath>
-        <m:r>
-          <m:t>e</m:t>
-        </m:r>
-        <m:r>
-          <m:rPr>
-            <m:sty m:val="p"/>
-          </m:rPr>
-          <m:t>′</m:t>
-        </m:r>
-        <m:r>
-          <m:t>e</m:t>
-        </m:r>
-      </m:oMath>
-      <w:r>
-        <w:t xml:space="preserve"> </w:t>
-      </w:r>
-      <w:r>
-        <w:t xml:space="preserve">is a scalar, it equals its own trace:</w:t>
+        <w:t xml:space="preserve">, and:</w:t>
       </w:r>
     </w:p>
     <w:p>
@@ -15344,7 +13625,21 @@
         </w:numPr>
       </w:pPr>
       <w:r>
-        <w:t xml:space="preserve">So</w:t>
+        <w:t xml:space="preserve">Here</w:t>
+      </w:r>
+      <w:r>
+        <w:t xml:space="preserve"> </w:t>
+      </w:r>
+      <m:oMath>
+        <m:r>
+          <m:t>p</m:t>
+        </m:r>
+      </m:oMath>
+      <w:r>
+        <w:t xml:space="preserve"> </w:t>
+      </w:r>
+      <w:r>
+        <w:t xml:space="preserve">is the number of parameters. So</w:t>
       </w:r>
       <w:r>
         <w:t xml:space="preserve"> </w:t>
@@ -15374,7 +13669,7 @@
         <w:t xml:space="preserve"> </w:t>
       </w:r>
       <w:r>
-        <w:t xml:space="preserve">is biased (it underestimates</w:t>
+        <w:t xml:space="preserve">is biased. It underestimates</w:t>
       </w:r>
       <w:r>
         <w:t xml:space="preserve"> </w:t>
@@ -15394,28 +13689,23 @@
         </m:sSup>
       </m:oMath>
       <w:r>
-        <w:t xml:space="preserve">), where</w:t>
+        <w:t xml:space="preserve">. The unbiased estimator divides by</w:t>
       </w:r>
       <w:r>
         <w:t xml:space="preserve"> </w:t>
       </w:r>
       <m:oMath>
         <m:r>
+          <m:t>n</m:t>
+        </m:r>
+        <m:r>
+          <m:rPr>
+            <m:sty m:val="p"/>
+          </m:rPr>
+          <m:t>−</m:t>
+        </m:r>
+        <m:r>
           <m:t>p</m:t>
-        </m:r>
-      </m:oMath>
-      <w:r>
-        <w:t xml:space="preserve"> </w:t>
-      </w:r>
-      <w:r>
-        <w:t xml:space="preserve">is the number of parameters. The unbiased estimator divides by the degrees of freedom instead of</w:t>
-      </w:r>
-      <w:r>
-        <w:t xml:space="preserve"> </w:t>
-      </w:r>
-      <m:oMath>
-        <m:r>
-          <m:t>n</m:t>
         </m:r>
       </m:oMath>
       <w:r>
@@ -15536,57 +13826,6 @@
           </m:sSup>
         </m:oMath>
       </m:oMathPara>
-    </w:p>
-    <w:p>
-      <w:pPr>
-        <w:numPr>
-          <w:ilvl w:val="0"/>
-          <w:numId w:val="1000"/>
-        </w:numPr>
-      </w:pPr>
-      <w:r>
-        <w:t xml:space="preserve">For the model in Item 1,</w:t>
-      </w:r>
-      <w:r>
-        <w:t xml:space="preserve"> </w:t>
-      </w:r>
-      <m:oMath>
-        <m:r>
-          <m:t>p</m:t>
-        </m:r>
-        <m:r>
-          <m:rPr>
-            <m:sty m:val="p"/>
-          </m:rPr>
-          <m:t>=</m:t>
-        </m:r>
-        <m:r>
-          <m:t>6</m:t>
-        </m:r>
-      </m:oMath>
-      <w:r>
-        <w:t xml:space="preserve">; for the model in Item 3,</w:t>
-      </w:r>
-      <w:r>
-        <w:t xml:space="preserve"> </w:t>
-      </w:r>
-      <m:oMath>
-        <m:r>
-          <m:t>p</m:t>
-        </m:r>
-        <m:r>
-          <m:rPr>
-            <m:sty m:val="p"/>
-          </m:rPr>
-          <m:t>=</m:t>
-        </m:r>
-        <m:r>
-          <m:t>1</m:t>
-        </m:r>
-      </m:oMath>
-      <w:r>
-        <w:t xml:space="preserve">.</w:t>
-      </w:r>
     </w:p>
     <w:p>
       <w:pPr>
@@ -16191,7 +14430,7 @@
         </w:numPr>
       </w:pPr>
       <w:r>
-        <w:t xml:space="preserve">The formula for the 3-variable case is</w:t>
+        <w:t xml:space="preserve">The formula for the 3-variable case is:</w:t>
       </w:r>
     </w:p>
     <w:p>
@@ -18885,8 +17124,8 @@
     <w:p>
       <w:pPr>
         <w:numPr>
-          <w:ilvl w:val="0"/>
-          <w:numId w:val="1000"/>
+          <w:ilvl w:val="1"/>
+          <w:numId w:val="1005"/>
         </w:numPr>
       </w:pPr>
       <m:oMath>
@@ -18970,12 +17209,15 @@
           <m:t>500</m:t>
         </m:r>
       </m:oMath>
-      <w:r>
-        <w:t xml:space="preserve">;</w:t>
-      </w:r>
-      <w:r>
-        <w:t xml:space="preserve"> </w:t>
-      </w:r>
+    </w:p>
+    <w:p>
+      <w:pPr>
+        <w:pStyle w:val="Compact"/>
+        <w:numPr>
+          <w:ilvl w:val="1"/>
+          <w:numId w:val="1005"/>
+        </w:numPr>
+      </w:pPr>
       <m:oMath>
         <m:sSub>
           <m:e>
@@ -18986,6 +17228,24 @@
           <m:sub>
             <m:r>
               <m:t>12</m:t>
+            </m:r>
+          </m:sub>
+        </m:sSub>
+        <m:r>
+          <m:rPr>
+            <m:sty m:val="p"/>
+          </m:rPr>
+          <m:t>=</m:t>
+        </m:r>
+        <m:sSub>
+          <m:e>
+            <m:r>
+              <m:t>C</m:t>
+            </m:r>
+          </m:e>
+          <m:sub>
+            <m:r>
+              <m:t>21</m:t>
             </m:r>
           </m:sub>
         </m:sSub>
@@ -19074,12 +17334,15 @@
           <m:t>000</m:t>
         </m:r>
       </m:oMath>
-      <w:r>
-        <w:t xml:space="preserve">;</w:t>
-      </w:r>
-      <w:r>
-        <w:t xml:space="preserve"> </w:t>
-      </w:r>
+    </w:p>
+    <w:p>
+      <w:pPr>
+        <w:pStyle w:val="Compact"/>
+        <w:numPr>
+          <w:ilvl w:val="1"/>
+          <w:numId w:val="1005"/>
+        </w:numPr>
+      </w:pPr>
       <m:oMath>
         <m:sSub>
           <m:e>
@@ -19099,6 +17362,24 @@
           </m:rPr>
           <m:t>=</m:t>
         </m:r>
+        <m:sSub>
+          <m:e>
+            <m:r>
+              <m:t>C</m:t>
+            </m:r>
+          </m:e>
+          <m:sub>
+            <m:r>
+              <m:t>31</m:t>
+            </m:r>
+          </m:sub>
+        </m:sSub>
+        <m:r>
+          <m:rPr>
+            <m:sty m:val="p"/>
+          </m:rPr>
+          <m:t>=</m:t>
+        </m:r>
         <m:r>
           <m:t>55</m:t>
         </m:r>
@@ -19162,12 +17443,15 @@
           <m:t>250</m:t>
         </m:r>
       </m:oMath>
-      <w:r>
-        <w:t xml:space="preserve">;</w:t>
-      </w:r>
-      <w:r>
-        <w:t xml:space="preserve"> </w:t>
-      </w:r>
+    </w:p>
+    <w:p>
+      <w:pPr>
+        <w:pStyle w:val="Compact"/>
+        <w:numPr>
+          <w:ilvl w:val="1"/>
+          <w:numId w:val="1005"/>
+        </w:numPr>
+      </w:pPr>
       <m:oMath>
         <m:sSub>
           <m:e>
@@ -19240,12 +17524,15 @@
           <m:t>000</m:t>
         </m:r>
       </m:oMath>
-      <w:r>
-        <w:t xml:space="preserve">;</w:t>
-      </w:r>
-      <w:r>
-        <w:t xml:space="preserve"> </w:t>
-      </w:r>
+    </w:p>
+    <w:p>
+      <w:pPr>
+        <w:pStyle w:val="Compact"/>
+        <w:numPr>
+          <w:ilvl w:val="1"/>
+          <w:numId w:val="1005"/>
+        </w:numPr>
+      </w:pPr>
       <m:oMath>
         <m:sSub>
           <m:e>
@@ -19256,6 +17543,24 @@
           <m:sub>
             <m:r>
               <m:t>23</m:t>
+            </m:r>
+          </m:sub>
+        </m:sSub>
+        <m:r>
+          <m:rPr>
+            <m:sty m:val="p"/>
+          </m:rPr>
+          <m:t>=</m:t>
+        </m:r>
+        <m:sSub>
+          <m:e>
+            <m:r>
+              <m:t>C</m:t>
+            </m:r>
+          </m:e>
+          <m:sub>
+            <m:r>
+              <m:t>32</m:t>
             </m:r>
           </m:sub>
         </m:sSub>
@@ -19338,12 +17643,15 @@
           <m:t>000</m:t>
         </m:r>
       </m:oMath>
-      <w:r>
-        <w:t xml:space="preserve">;</w:t>
-      </w:r>
-      <w:r>
-        <w:t xml:space="preserve"> </w:t>
-      </w:r>
+    </w:p>
+    <w:p>
+      <w:pPr>
+        <w:pStyle w:val="Compact"/>
+        <w:numPr>
+          <w:ilvl w:val="1"/>
+          <w:numId w:val="1005"/>
+        </w:numPr>
+      </w:pPr>
       <m:oMath>
         <m:sSub>
           <m:e>
@@ -19407,153 +17715,10 @@
           <m:t>825</m:t>
         </m:r>
       </m:oMath>
-      <w:r>
-        <w:t xml:space="preserve">. Since</w:t>
-      </w:r>
-      <w:r>
-        <w:t xml:space="preserve"> </w:t>
-      </w:r>
-      <m:oMath>
-        <m:r>
-          <m:t>X</m:t>
-        </m:r>
-        <m:r>
-          <m:rPr>
-            <m:sty m:val="p"/>
-          </m:rPr>
-          <m:t>′</m:t>
-        </m:r>
-        <m:r>
-          <m:t>X</m:t>
-        </m:r>
-      </m:oMath>
-      <w:r>
-        <w:t xml:space="preserve"> </w:t>
-      </w:r>
-      <w:r>
-        <w:t xml:space="preserve">is symmetric,</w:t>
-      </w:r>
-      <w:r>
-        <w:t xml:space="preserve"> </w:t>
-      </w:r>
-      <m:oMath>
-        <m:sSub>
-          <m:e>
-            <m:r>
-              <m:t>C</m:t>
-            </m:r>
-          </m:e>
-          <m:sub>
-            <m:r>
-              <m:t>21</m:t>
-            </m:r>
-          </m:sub>
-        </m:sSub>
-        <m:r>
-          <m:rPr>
-            <m:sty m:val="p"/>
-          </m:rPr>
-          <m:t>=</m:t>
-        </m:r>
-        <m:sSub>
-          <m:e>
-            <m:r>
-              <m:t>C</m:t>
-            </m:r>
-          </m:e>
-          <m:sub>
-            <m:r>
-              <m:t>12</m:t>
-            </m:r>
-          </m:sub>
-        </m:sSub>
-      </m:oMath>
-      <w:r>
-        <w:t xml:space="preserve">,</w:t>
-      </w:r>
-      <w:r>
-        <w:t xml:space="preserve"> </w:t>
-      </w:r>
-      <m:oMath>
-        <m:sSub>
-          <m:e>
-            <m:r>
-              <m:t>C</m:t>
-            </m:r>
-          </m:e>
-          <m:sub>
-            <m:r>
-              <m:t>31</m:t>
-            </m:r>
-          </m:sub>
-        </m:sSub>
-        <m:r>
-          <m:rPr>
-            <m:sty m:val="p"/>
-          </m:rPr>
-          <m:t>=</m:t>
-        </m:r>
-        <m:sSub>
-          <m:e>
-            <m:r>
-              <m:t>C</m:t>
-            </m:r>
-          </m:e>
-          <m:sub>
-            <m:r>
-              <m:t>13</m:t>
-            </m:r>
-          </m:sub>
-        </m:sSub>
-      </m:oMath>
-      <w:r>
-        <w:t xml:space="preserve"> </w:t>
-      </w:r>
-      <w:r>
-        <w:t xml:space="preserve">and</w:t>
-      </w:r>
-      <w:r>
-        <w:t xml:space="preserve"> </w:t>
-      </w:r>
-      <m:oMath>
-        <m:sSub>
-          <m:e>
-            <m:r>
-              <m:t>C</m:t>
-            </m:r>
-          </m:e>
-          <m:sub>
-            <m:r>
-              <m:t>32</m:t>
-            </m:r>
-          </m:sub>
-        </m:sSub>
-        <m:r>
-          <m:rPr>
-            <m:sty m:val="p"/>
-          </m:rPr>
-          <m:t>=</m:t>
-        </m:r>
-        <m:sSub>
-          <m:e>
-            <m:r>
-              <m:t>C</m:t>
-            </m:r>
-          </m:e>
-          <m:sub>
-            <m:r>
-              <m:t>23</m:t>
-            </m:r>
-          </m:sub>
-        </m:sSub>
-      </m:oMath>
-      <w:r>
-        <w:t xml:space="preserve">.</w:t>
-      </w:r>
     </w:p>
     <w:p>
       <w:pPr>
-        <w:pStyle w:val="BodyText"/>
+        <w:pStyle w:val="FirstParagraph"/>
       </w:pPr>
       <m:oMathPara>
         <m:oMathParaPr>
@@ -20949,181 +19114,18 @@
     </w:p>
     <w:p>
       <w:pPr>
-        <w:pStyle w:val="FirstParagraph"/>
-      </w:pPr>
-      <m:oMathPara>
-        <m:oMathParaPr>
-          <m:jc m:val="center"/>
-        </m:oMathParaPr>
-        <m:oMath>
-          <m:sSub>
-            <m:e>
-              <m:r>
-                <m:t>b</m:t>
-              </m:r>
-            </m:e>
-            <m:sub>
-              <m:r>
-                <m:t>0</m:t>
-              </m:r>
-            </m:sub>
-          </m:sSub>
-          <m:r>
-            <m:rPr>
-              <m:sty m:val="p"/>
-            </m:rPr>
-            <m:t>=</m:t>
-          </m:r>
-          <m:r>
-            <m:t>0</m:t>
-          </m:r>
-          <m:r>
-            <m:rPr>
-              <m:sty m:val="p"/>
-            </m:rPr>
-            <m:t>,</m:t>
-          </m:r>
-          <m:r>
-            <m:t>  </m:t>
-          </m:r>
-          <m:sSub>
-            <m:e>
-              <m:r>
-                <m:t>b</m:t>
-              </m:r>
-            </m:e>
-            <m:sub>
-              <m:r>
-                <m:t>1</m:t>
-              </m:r>
-            </m:sub>
-          </m:sSub>
-          <m:r>
-            <m:rPr>
-              <m:sty m:val="p"/>
-            </m:rPr>
-            <m:t>=</m:t>
-          </m:r>
-          <m:r>
-            <m:t>2</m:t>
-          </m:r>
-          <m:r>
-            <m:rPr>
-              <m:sty m:val="p"/>
-            </m:rPr>
-            <m:t>,</m:t>
-          </m:r>
-          <m:r>
-            <m:t>  </m:t>
-          </m:r>
-          <m:sSub>
-            <m:e>
-              <m:r>
-                <m:t>b</m:t>
-              </m:r>
-            </m:e>
-            <m:sub>
-              <m:r>
-                <m:t>2</m:t>
-              </m:r>
-            </m:sub>
-          </m:sSub>
-          <m:r>
-            <m:rPr>
-              <m:sty m:val="p"/>
-            </m:rPr>
-            <m:t>=</m:t>
-          </m:r>
-          <m:r>
-            <m:t>0</m:t>
-          </m:r>
-          <m:r>
-            <m:t>  </m:t>
-          </m:r>
-          <m:r>
-            <m:rPr>
-              <m:sty m:val="p"/>
-            </m:rPr>
-            <m:t>⇒</m:t>
-          </m:r>
-          <m:r>
-            <m:t>  </m:t>
-          </m:r>
-          <m:acc>
-            <m:accPr>
-              <m:chr m:val="̂"/>
-            </m:accPr>
-            <m:e>
-              <m:r>
-                <m:t>Y</m:t>
-              </m:r>
-            </m:e>
-          </m:acc>
-          <m:r>
-            <m:rPr>
-              <m:sty m:val="p"/>
-            </m:rPr>
-            <m:t>=</m:t>
-          </m:r>
-          <m:r>
-            <m:t>2</m:t>
-          </m:r>
-          <m:sSub>
-            <m:e>
-              <m:r>
-                <m:t>X</m:t>
-              </m:r>
-            </m:e>
-            <m:sub>
-              <m:r>
-                <m:t>1</m:t>
-              </m:r>
-            </m:sub>
-          </m:sSub>
-        </m:oMath>
-      </m:oMathPara>
-    </w:p>
-    <w:p>
-      <w:pPr>
         <w:numPr>
           <w:ilvl w:val="0"/>
           <w:numId w:val="1000"/>
         </w:numPr>
       </w:pPr>
       <w:r>
-        <w:rPr>
-          <w:iCs/>
-          <w:i/>
-        </w:rPr>
-        <w:t xml:space="preserve">Check with the normal equations:</w:t>
-      </w:r>
-    </w:p>
-    <w:p>
-      <w:pPr>
-        <w:numPr>
-          <w:ilvl w:val="1"/>
-          <w:numId w:val="1005"/>
-        </w:numPr>
-      </w:pPr>
+        <w:t xml:space="preserve">Therefore,</w:t>
+      </w:r>
+      <w:r>
+        <w:t xml:space="preserve"> </w:t>
+      </w:r>
       <m:oMath>
-        <m:r>
-          <m:rPr>
-            <m:sty m:val="p"/>
-          </m:rPr>
-          <m:t>∑</m:t>
-        </m:r>
-        <m:r>
-          <m:t>Y</m:t>
-        </m:r>
-        <m:r>
-          <m:rPr>
-            <m:sty m:val="p"/>
-          </m:rPr>
-          <m:t>=</m:t>
-        </m:r>
-        <m:r>
-          <m:t>n</m:t>
-        </m:r>
         <m:sSub>
           <m:e>
             <m:r>
@@ -21140,8 +19142,19 @@
           <m:rPr>
             <m:sty m:val="p"/>
           </m:rPr>
-          <m:t>+</m:t>
-        </m:r>
+          <m:t>=</m:t>
+        </m:r>
+        <m:r>
+          <m:t>0</m:t>
+        </m:r>
+      </m:oMath>
+      <w:r>
+        <w:t xml:space="preserve">,</w:t>
+      </w:r>
+      <w:r>
+        <w:t xml:space="preserve"> </w:t>
+      </w:r>
+      <m:oMath>
         <m:sSub>
           <m:e>
             <m:r>
@@ -21158,26 +19171,22 @@
           <m:rPr>
             <m:sty m:val="p"/>
           </m:rPr>
-          <m:t>∑</m:t>
-        </m:r>
-        <m:sSub>
-          <m:e>
-            <m:r>
-              <m:t>X</m:t>
-            </m:r>
-          </m:e>
-          <m:sub>
-            <m:r>
-              <m:t>1</m:t>
-            </m:r>
-          </m:sub>
-        </m:sSub>
-        <m:r>
-          <m:rPr>
-            <m:sty m:val="p"/>
-          </m:rPr>
-          <m:t>+</m:t>
-        </m:r>
+          <m:t>=</m:t>
+        </m:r>
+        <m:r>
+          <m:t>2</m:t>
+        </m:r>
+      </m:oMath>
+      <w:r>
+        <w:t xml:space="preserve"> </w:t>
+      </w:r>
+      <w:r>
+        <w:t xml:space="preserve">and</w:t>
+      </w:r>
+      <w:r>
+        <w:t xml:space="preserve"> </w:t>
+      </w:r>
+      <m:oMath>
         <m:sSub>
           <m:e>
             <m:r>
@@ -21194,589 +19203,35 @@
           <m:rPr>
             <m:sty m:val="p"/>
           </m:rPr>
-          <m:t>∑</m:t>
-        </m:r>
-        <m:sSub>
+          <m:t>=</m:t>
+        </m:r>
+        <m:r>
+          <m:t>0</m:t>
+        </m:r>
+      </m:oMath>
+      <w:r>
+        <w:t xml:space="preserve">. The fitted model is</w:t>
+      </w:r>
+      <w:r>
+        <w:t xml:space="preserve"> </w:t>
+      </w:r>
+      <m:oMath>
+        <m:acc>
+          <m:accPr>
+            <m:chr m:val="̂"/>
+          </m:accPr>
           <m:e>
             <m:r>
-              <m:t>X</m:t>
+              <m:t>Y</m:t>
             </m:r>
           </m:e>
-          <m:sub>
-            <m:r>
-              <m:t>2</m:t>
-            </m:r>
-          </m:sub>
-        </m:sSub>
-      </m:oMath>
-      <w:r>
-        <w:t xml:space="preserve">:</w:t>
-      </w:r>
-      <w:r>
-        <w:t xml:space="preserve"> </w:t>
-      </w:r>
-      <m:oMath>
-        <m:r>
-          <m:t> </m:t>
-        </m:r>
-        <m:r>
-          <m:t>110</m:t>
-        </m:r>
+        </m:acc>
         <m:r>
           <m:rPr>
             <m:sty m:val="p"/>
           </m:rPr>
           <m:t>=</m:t>
         </m:r>
-        <m:r>
-          <m:t>10</m:t>
-        </m:r>
-        <m:d>
-          <m:dPr>
-            <m:begChr m:val="("/>
-            <m:sepChr m:val=""/>
-            <m:endChr m:val=")"/>
-            <m:grow/>
-          </m:dPr>
-          <m:e>
-            <m:r>
-              <m:t>0</m:t>
-            </m:r>
-          </m:e>
-        </m:d>
-        <m:r>
-          <m:rPr>
-            <m:sty m:val="p"/>
-          </m:rPr>
-          <m:t>+</m:t>
-        </m:r>
-        <m:r>
-          <m:t>2</m:t>
-        </m:r>
-        <m:d>
-          <m:dPr>
-            <m:begChr m:val="("/>
-            <m:sepChr m:val=""/>
-            <m:endChr m:val=")"/>
-            <m:grow/>
-          </m:dPr>
-          <m:e>
-            <m:r>
-              <m:t>55</m:t>
-            </m:r>
-          </m:e>
-        </m:d>
-        <m:r>
-          <m:rPr>
-            <m:sty m:val="p"/>
-          </m:rPr>
-          <m:t>+</m:t>
-        </m:r>
-        <m:r>
-          <m:t>0</m:t>
-        </m:r>
-        <m:d>
-          <m:dPr>
-            <m:begChr m:val="("/>
-            <m:sepChr m:val=""/>
-            <m:endChr m:val=")"/>
-            <m:grow/>
-          </m:dPr>
-          <m:e>
-            <m:r>
-              <m:t>500</m:t>
-            </m:r>
-          </m:e>
-        </m:d>
-        <m:r>
-          <m:rPr>
-            <m:sty m:val="p"/>
-          </m:rPr>
-          <m:t>=</m:t>
-        </m:r>
-        <m:r>
-          <m:t>110</m:t>
-        </m:r>
-      </m:oMath>
-    </w:p>
-    <w:p>
-      <w:pPr>
-        <w:pStyle w:val="Compact"/>
-        <w:numPr>
-          <w:ilvl w:val="1"/>
-          <w:numId w:val="1005"/>
-        </w:numPr>
-      </w:pPr>
-      <m:oMath>
-        <m:r>
-          <m:rPr>
-            <m:sty m:val="p"/>
-          </m:rPr>
-          <m:t>∑</m:t>
-        </m:r>
-        <m:sSub>
-          <m:e>
-            <m:r>
-              <m:t>X</m:t>
-            </m:r>
-          </m:e>
-          <m:sub>
-            <m:r>
-              <m:t>1</m:t>
-            </m:r>
-          </m:sub>
-        </m:sSub>
-        <m:r>
-          <m:t>Y</m:t>
-        </m:r>
-        <m:r>
-          <m:rPr>
-            <m:sty m:val="p"/>
-          </m:rPr>
-          <m:t>=</m:t>
-        </m:r>
-        <m:sSub>
-          <m:e>
-            <m:r>
-              <m:t>b</m:t>
-            </m:r>
-          </m:e>
-          <m:sub>
-            <m:r>
-              <m:t>0</m:t>
-            </m:r>
-          </m:sub>
-        </m:sSub>
-        <m:r>
-          <m:rPr>
-            <m:sty m:val="p"/>
-          </m:rPr>
-          <m:t>∑</m:t>
-        </m:r>
-        <m:sSub>
-          <m:e>
-            <m:r>
-              <m:t>X</m:t>
-            </m:r>
-          </m:e>
-          <m:sub>
-            <m:r>
-              <m:t>1</m:t>
-            </m:r>
-          </m:sub>
-        </m:sSub>
-        <m:r>
-          <m:rPr>
-            <m:sty m:val="p"/>
-          </m:rPr>
-          <m:t>+</m:t>
-        </m:r>
-        <m:sSub>
-          <m:e>
-            <m:r>
-              <m:t>b</m:t>
-            </m:r>
-          </m:e>
-          <m:sub>
-            <m:r>
-              <m:t>1</m:t>
-            </m:r>
-          </m:sub>
-        </m:sSub>
-        <m:r>
-          <m:rPr>
-            <m:sty m:val="p"/>
-          </m:rPr>
-          <m:t>∑</m:t>
-        </m:r>
-        <m:sSubSup>
-          <m:e>
-            <m:r>
-              <m:t>X</m:t>
-            </m:r>
-          </m:e>
-          <m:sub>
-            <m:r>
-              <m:t>1</m:t>
-            </m:r>
-          </m:sub>
-          <m:sup>
-            <m:r>
-              <m:t>2</m:t>
-            </m:r>
-          </m:sup>
-        </m:sSubSup>
-        <m:r>
-          <m:rPr>
-            <m:sty m:val="p"/>
-          </m:rPr>
-          <m:t>+</m:t>
-        </m:r>
-        <m:sSub>
-          <m:e>
-            <m:r>
-              <m:t>b</m:t>
-            </m:r>
-          </m:e>
-          <m:sub>
-            <m:r>
-              <m:t>2</m:t>
-            </m:r>
-          </m:sub>
-        </m:sSub>
-        <m:r>
-          <m:rPr>
-            <m:sty m:val="p"/>
-          </m:rPr>
-          <m:t>∑</m:t>
-        </m:r>
-        <m:sSub>
-          <m:e>
-            <m:r>
-              <m:t>X</m:t>
-            </m:r>
-          </m:e>
-          <m:sub>
-            <m:r>
-              <m:t>1</m:t>
-            </m:r>
-          </m:sub>
-        </m:sSub>
-        <m:sSub>
-          <m:e>
-            <m:r>
-              <m:t>X</m:t>
-            </m:r>
-          </m:e>
-          <m:sub>
-            <m:r>
-              <m:t>2</m:t>
-            </m:r>
-          </m:sub>
-        </m:sSub>
-      </m:oMath>
-      <w:r>
-        <w:t xml:space="preserve">:</w:t>
-      </w:r>
-      <w:r>
-        <w:t xml:space="preserve"> </w:t>
-      </w:r>
-      <m:oMath>
-        <m:r>
-          <m:t> </m:t>
-        </m:r>
-        <m:r>
-          <m:t>770</m:t>
-        </m:r>
-        <m:r>
-          <m:rPr>
-            <m:sty m:val="p"/>
-          </m:rPr>
-          <m:t>=</m:t>
-        </m:r>
-        <m:r>
-          <m:t>0</m:t>
-        </m:r>
-        <m:r>
-          <m:rPr>
-            <m:sty m:val="p"/>
-          </m:rPr>
-          <m:t>+</m:t>
-        </m:r>
-        <m:r>
-          <m:t>2</m:t>
-        </m:r>
-        <m:d>
-          <m:dPr>
-            <m:begChr m:val="("/>
-            <m:sepChr m:val=""/>
-            <m:endChr m:val=")"/>
-            <m:grow/>
-          </m:dPr>
-          <m:e>
-            <m:r>
-              <m:t>385</m:t>
-            </m:r>
-          </m:e>
-        </m:d>
-        <m:r>
-          <m:rPr>
-            <m:sty m:val="p"/>
-          </m:rPr>
-          <m:t>+</m:t>
-        </m:r>
-        <m:r>
-          <m:t>0</m:t>
-        </m:r>
-        <m:r>
-          <m:rPr>
-            <m:sty m:val="p"/>
-          </m:rPr>
-          <m:t>=</m:t>
-        </m:r>
-        <m:r>
-          <m:t>770</m:t>
-        </m:r>
-      </m:oMath>
-    </w:p>
-    <w:p>
-      <w:pPr>
-        <w:pStyle w:val="Compact"/>
-        <w:numPr>
-          <w:ilvl w:val="1"/>
-          <w:numId w:val="1005"/>
-        </w:numPr>
-      </w:pPr>
-      <m:oMath>
-        <m:r>
-          <m:rPr>
-            <m:sty m:val="p"/>
-          </m:rPr>
-          <m:t>∑</m:t>
-        </m:r>
-        <m:sSub>
-          <m:e>
-            <m:r>
-              <m:t>X</m:t>
-            </m:r>
-          </m:e>
-          <m:sub>
-            <m:r>
-              <m:t>2</m:t>
-            </m:r>
-          </m:sub>
-        </m:sSub>
-        <m:r>
-          <m:t>Y</m:t>
-        </m:r>
-        <m:r>
-          <m:rPr>
-            <m:sty m:val="p"/>
-          </m:rPr>
-          <m:t>=</m:t>
-        </m:r>
-        <m:sSub>
-          <m:e>
-            <m:r>
-              <m:t>b</m:t>
-            </m:r>
-          </m:e>
-          <m:sub>
-            <m:r>
-              <m:t>0</m:t>
-            </m:r>
-          </m:sub>
-        </m:sSub>
-        <m:r>
-          <m:rPr>
-            <m:sty m:val="p"/>
-          </m:rPr>
-          <m:t>∑</m:t>
-        </m:r>
-        <m:sSub>
-          <m:e>
-            <m:r>
-              <m:t>X</m:t>
-            </m:r>
-          </m:e>
-          <m:sub>
-            <m:r>
-              <m:t>2</m:t>
-            </m:r>
-          </m:sub>
-        </m:sSub>
-        <m:r>
-          <m:rPr>
-            <m:sty m:val="p"/>
-          </m:rPr>
-          <m:t>+</m:t>
-        </m:r>
-        <m:sSub>
-          <m:e>
-            <m:r>
-              <m:t>b</m:t>
-            </m:r>
-          </m:e>
-          <m:sub>
-            <m:r>
-              <m:t>1</m:t>
-            </m:r>
-          </m:sub>
-        </m:sSub>
-        <m:r>
-          <m:rPr>
-            <m:sty m:val="p"/>
-          </m:rPr>
-          <m:t>∑</m:t>
-        </m:r>
-        <m:sSub>
-          <m:e>
-            <m:r>
-              <m:t>X</m:t>
-            </m:r>
-          </m:e>
-          <m:sub>
-            <m:r>
-              <m:t>1</m:t>
-            </m:r>
-          </m:sub>
-        </m:sSub>
-        <m:sSub>
-          <m:e>
-            <m:r>
-              <m:t>X</m:t>
-            </m:r>
-          </m:e>
-          <m:sub>
-            <m:r>
-              <m:t>2</m:t>
-            </m:r>
-          </m:sub>
-        </m:sSub>
-        <m:r>
-          <m:rPr>
-            <m:sty m:val="p"/>
-          </m:rPr>
-          <m:t>+</m:t>
-        </m:r>
-        <m:sSub>
-          <m:e>
-            <m:r>
-              <m:t>b</m:t>
-            </m:r>
-          </m:e>
-          <m:sub>
-            <m:r>
-              <m:t>2</m:t>
-            </m:r>
-          </m:sub>
-        </m:sSub>
-        <m:r>
-          <m:rPr>
-            <m:sty m:val="p"/>
-          </m:rPr>
-          <m:t>∑</m:t>
-        </m:r>
-        <m:sSubSup>
-          <m:e>
-            <m:r>
-              <m:t>X</m:t>
-            </m:r>
-          </m:e>
-          <m:sub>
-            <m:r>
-              <m:t>2</m:t>
-            </m:r>
-          </m:sub>
-          <m:sup>
-            <m:r>
-              <m:t>2</m:t>
-            </m:r>
-          </m:sup>
-        </m:sSubSup>
-      </m:oMath>
-      <w:r>
-        <w:t xml:space="preserve">:</w:t>
-      </w:r>
-      <w:r>
-        <w:t xml:space="preserve"> </w:t>
-      </w:r>
-      <m:oMath>
-        <m:r>
-          <m:t> </m:t>
-        </m:r>
-        <m:r>
-          <m:t>5100</m:t>
-        </m:r>
-        <m:r>
-          <m:rPr>
-            <m:sty m:val="p"/>
-          </m:rPr>
-          <m:t>=</m:t>
-        </m:r>
-        <m:r>
-          <m:t>0</m:t>
-        </m:r>
-        <m:r>
-          <m:rPr>
-            <m:sty m:val="p"/>
-          </m:rPr>
-          <m:t>+</m:t>
-        </m:r>
-        <m:r>
-          <m:t>2</m:t>
-        </m:r>
-        <m:d>
-          <m:dPr>
-            <m:begChr m:val="("/>
-            <m:sepChr m:val=""/>
-            <m:endChr m:val=")"/>
-            <m:grow/>
-          </m:dPr>
-          <m:e>
-            <m:r>
-              <m:t>2550</m:t>
-            </m:r>
-          </m:e>
-        </m:d>
-        <m:r>
-          <m:rPr>
-            <m:sty m:val="p"/>
-          </m:rPr>
-          <m:t>+</m:t>
-        </m:r>
-        <m:r>
-          <m:t>0</m:t>
-        </m:r>
-        <m:r>
-          <m:rPr>
-            <m:sty m:val="p"/>
-          </m:rPr>
-          <m:t>=</m:t>
-        </m:r>
-        <m:r>
-          <m:t>5100</m:t>
-        </m:r>
-      </m:oMath>
-    </w:p>
-    <w:p>
-      <w:pPr>
-        <w:numPr>
-          <w:ilvl w:val="0"/>
-          <w:numId w:val="1000"/>
-        </w:numPr>
-      </w:pPr>
-      <w:r>
-        <w:rPr>
-          <w:iCs/>
-          <w:i/>
-        </w:rPr>
-        <w:t xml:space="preserve">Interpretation.</w:t>
-      </w:r>
-      <w:r>
-        <w:t xml:space="preserve"> </w:t>
-      </w:r>
-      <w:r>
-        <w:t xml:space="preserve">Every value of</w:t>
-      </w:r>
-      <w:r>
-        <w:t xml:space="preserve"> </w:t>
-      </w:r>
-      <m:oMath>
-        <m:r>
-          <m:t>Y</m:t>
-        </m:r>
-      </m:oMath>
-      <w:r>
-        <w:t xml:space="preserve"> </w:t>
-      </w:r>
-      <w:r>
-        <w:t xml:space="preserve">is exactly</w:t>
-      </w:r>
-      <w:r>
-        <w:t xml:space="preserve"> </w:t>
-      </w:r>
-      <m:oMath>
         <m:r>
           <m:t>2</m:t>
         </m:r>
@@ -21794,114 +19249,7 @@
         </m:sSub>
       </m:oMath>
       <w:r>
-        <w:t xml:space="preserve"> </w:t>
-      </w:r>
-      <w:r>
-        <w:t xml:space="preserve">(this is data set A from the Lesson 1 Activity). This is the exact relationship case from Lecture 1A: all points lie on a straight line, so the fit is perfect (every</w:t>
-      </w:r>
-      <w:r>
-        <w:t xml:space="preserve"> </w:t>
-      </w:r>
-      <m:oMath>
-        <m:sSub>
-          <m:e>
-            <m:r>
-              <m:t>e</m:t>
-            </m:r>
-          </m:e>
-          <m:sub>
-            <m:r>
-              <m:t>i</m:t>
-            </m:r>
-          </m:sub>
-        </m:sSub>
-        <m:r>
-          <m:rPr>
-            <m:sty m:val="p"/>
-          </m:rPr>
-          <m:t>=</m:t>
-        </m:r>
-        <m:r>
-          <m:t>0</m:t>
-        </m:r>
-      </m:oMath>
-      <w:r>
-        <w:t xml:space="preserve"> </w:t>
-      </w:r>
-      <w:r>
-        <w:t xml:space="preserve">and</w:t>
-      </w:r>
-      <w:r>
-        <w:t xml:space="preserve"> </w:t>
-      </w:r>
-      <m:oMath>
-        <m:r>
-          <m:rPr>
-            <m:nor/>
-          </m:rPr>
-          <m:t>RSS</m:t>
-        </m:r>
-        <m:r>
-          <m:rPr>
-            <m:sty m:val="p"/>
-          </m:rPr>
-          <m:t>=</m:t>
-        </m:r>
-        <m:r>
-          <m:t>0</m:t>
-        </m:r>
-      </m:oMath>
-      <w:r>
-        <w:t xml:space="preserve">), the intercept is 0, and</w:t>
-      </w:r>
-      <w:r>
-        <w:t xml:space="preserve"> </w:t>
-      </w:r>
-      <m:oMath>
-        <m:sSub>
-          <m:e>
-            <m:r>
-              <m:t>X</m:t>
-            </m:r>
-          </m:e>
-          <m:sub>
-            <m:r>
-              <m:t>2</m:t>
-            </m:r>
-          </m:sub>
-        </m:sSub>
-      </m:oMath>
-      <w:r>
-        <w:t xml:space="preserve"> </w:t>
-      </w:r>
-      <w:r>
-        <w:t xml:space="preserve">adds nothing to the model (</w:t>
-      </w:r>
-      <m:oMath>
-        <m:sSub>
-          <m:e>
-            <m:r>
-              <m:t>b</m:t>
-            </m:r>
-          </m:e>
-          <m:sub>
-            <m:r>
-              <m:t>2</m:t>
-            </m:r>
-          </m:sub>
-        </m:sSub>
-        <m:r>
-          <m:rPr>
-            <m:sty m:val="p"/>
-          </m:rPr>
-          <m:t>=</m:t>
-        </m:r>
-        <m:r>
-          <m:t>0</m:t>
-        </m:r>
-      </m:oMath>
-      <w:r>
-        <w:t xml:space="preserve">).</w:t>
+        <w:t xml:space="preserve">.</w:t>
       </w:r>
     </w:p>
     <w:sectPr>

</xml_diff>